<commit_message>
BRONZE_VS_MIRRORING: add env-to-env promotion (ALM) complexity section for mirroring
</commit_message>
<xml_diff>
--- a/control_plane/docs/BRONZE_VS_MIRRORING.docx
+++ b/control_plane/docs/BRONZE_VS_MIRRORING.docx
@@ -1252,7 +1252,7 @@
                 <w:b/>
                 <w:sz w:val="18"/>
               </w:rPr>
-              <w:t>Promotion / lineage</w:t>
+              <w:t>Promotion (DEV→UAT→PROD)</w:t>
             </w:r>
           </w:p>
         </w:tc>
@@ -1270,7 +1270,33 @@
               <w:rPr>
                 <w:sz w:val="18"/>
               </w:rPr>
-              <w:t>Configured per environment in the portal</w:t>
+              <w:t xml:space="preserve">Git/pipelines track the mirror *item* only; connection, </w:t>
+            </w:r>
+            <w:r>
+              <w:rPr>
+                <w:b/>
+                <w:sz w:val="18"/>
+              </w:rPr>
+              <w:t>manual start</w:t>
+            </w:r>
+            <w:r>
+              <w:rPr>
+                <w:sz w:val="18"/>
+              </w:rPr>
+              <w:t xml:space="preserve">, </w:t>
+            </w:r>
+            <w:r>
+              <w:rPr>
+                <w:b/>
+                <w:sz w:val="18"/>
+              </w:rPr>
+              <w:t>re-seed</w:t>
+            </w:r>
+            <w:r>
+              <w:rPr>
+                <w:sz w:val="18"/>
+              </w:rPr>
+              <w:t>, and views are per-env manual (see §4)</w:t>
             </w:r>
           </w:p>
         </w:tc>
@@ -1289,21 +1315,13 @@
                 <w:b/>
                 <w:sz w:val="18"/>
               </w:rPr>
-              <w:t>Config-as-code</w:t>
+              <w:t>Whole medallion is config-as-code</w:t>
             </w:r>
             <w:r>
               <w:rPr>
                 <w:sz w:val="18"/>
               </w:rPr>
-              <w:t xml:space="preserve">, promoted DEV→UAT→PROD; lineage in </w:t>
-            </w:r>
-            <w:r>
-              <w:rPr>
-                <w:rFonts w:ascii="Consolas" w:hAnsi="Consolas"/>
-                <w:color w:val="A31F34"/>
-                <w:sz w:val="18"/>
-              </w:rPr>
-              <w:t>config_db</w:t>
+              <w:t xml:space="preserve"> — sources+DQ+gold+security promote together; connection = a KV secret per env</w:t>
             </w:r>
           </w:p>
         </w:tc>
@@ -1879,7 +1897,17 @@
       </w:pPr>
       <w:r/>
       <w:r>
-        <w:t>4. When to choose which</w:t>
+        <w:t>4. Promotion across environments (DEV → UAT → PROD)</w:t>
+      </w:r>
+    </w:p>
+    <w:p>
+      <w:r>
+        <w:t>This is where the two diverge most for a governed shop — the user explicitly asked, so it's worth</w:t>
+      </w:r>
+    </w:p>
+    <w:p>
+      <w:r>
+        <w:t>its own section.</w:t>
       </w:r>
     </w:p>
     <w:p>
@@ -1887,111 +1915,390 @@
         <w:rPr>
           <w:b/>
         </w:rPr>
-        <w:t>Lean Mirroring when</w:t>
-      </w:r>
-      <w:r>
-        <w:t xml:space="preserve"> *all* hold: the table needs </w:t>
-      </w:r>
+        <w:t>Our framework — one config-as-code unit.</w:t>
+      </w:r>
+      <w:r>
+        <w:t xml:space="preserve"> The *entire* medallion — sources, subset/</w:t>
+      </w:r>
+      <w:r>
+        <w:rPr>
+          <w:rFonts w:ascii="Consolas" w:hAnsi="Consolas"/>
+          <w:color w:val="A31F34"/>
+        </w:rPr>
+        <w:t>select</w:t>
+      </w:r>
+    </w:p>
+    <w:p>
+      <w:r>
+        <w:t xml:space="preserve">rules, </w:t>
+      </w:r>
+      <w:r>
+        <w:rPr>
+          <w:rFonts w:ascii="Consolas" w:hAnsi="Consolas"/>
+          <w:color w:val="A31F34"/>
+        </w:rPr>
+        <w:t>cleanse_rule</w:t>
+      </w:r>
+      <w:r>
+        <w:t xml:space="preserve">, </w:t>
+      </w:r>
+      <w:r>
+        <w:rPr>
+          <w:rFonts w:ascii="Consolas" w:hAnsi="Consolas"/>
+          <w:color w:val="A31F34"/>
+        </w:rPr>
+        <w:t>dq_rule</w:t>
+      </w:r>
+      <w:r>
+        <w:t xml:space="preserve">, the gold </w:t>
+      </w:r>
+      <w:r>
+        <w:rPr>
+          <w:rFonts w:ascii="Consolas" w:hAnsi="Consolas"/>
+          <w:color w:val="A31F34"/>
+        </w:rPr>
+        <w:t>model</w:t>
+      </w:r>
+      <w:r>
+        <w:t>/</w:t>
+      </w:r>
+      <w:r>
+        <w:rPr>
+          <w:rFonts w:ascii="Consolas" w:hAnsi="Consolas"/>
+          <w:color w:val="A31F34"/>
+        </w:rPr>
+        <w:t>gold_object</w:t>
+      </w:r>
+      <w:r>
+        <w:t xml:space="preserve">, and </w:t>
+      </w:r>
+      <w:r>
+        <w:rPr>
+          <w:rFonts w:ascii="Consolas" w:hAnsi="Consolas"/>
+          <w:color w:val="A31F34"/>
+        </w:rPr>
+        <w:t>security_policy</w:t>
+      </w:r>
+      <w:r>
+        <w:t xml:space="preserve"> — lives in</w:t>
+      </w:r>
+    </w:p>
+    <w:p>
+      <w:r>
+        <w:rPr>
+          <w:rFonts w:ascii="Consolas" w:hAnsi="Consolas"/>
+          <w:color w:val="A31F34"/>
+        </w:rPr>
+        <w:t>config_db</w:t>
+      </w:r>
+      <w:r>
+        <w:t xml:space="preserve"> and promotes as YAML (</w:t>
+      </w:r>
+      <w:r>
+        <w:rPr>
+          <w:rFonts w:ascii="Consolas" w:hAnsi="Consolas"/>
+          <w:color w:val="A31F34"/>
+        </w:rPr>
+        <w:t>cp_config</w:t>
+      </w:r>
+      <w:r>
+        <w:t>) alongside the bundled engine, which deploys</w:t>
+      </w:r>
+    </w:p>
+    <w:p>
       <w:r>
         <w:rPr>
           <w:b/>
         </w:rPr>
-        <w:t>near-real-time</w:t>
-      </w:r>
-      <w:r>
-        <w:t xml:space="preserve"> freshness; it's **cleanly</w:t>
+        <w:t>identically</w:t>
+      </w:r>
+      <w:r>
+        <w:t xml:space="preserve"> to every environment. Connections resolve from a Key Vault </w:t>
+      </w:r>
+      <w:r>
+        <w:rPr>
+          <w:rFonts w:ascii="Consolas" w:hAnsi="Consolas"/>
+          <w:color w:val="A31F34"/>
+        </w:rPr>
+        <w:t>secret_name</w:t>
+      </w:r>
+      <w:r>
+        <w:t xml:space="preserve"> (one secret</w:t>
       </w:r>
     </w:p>
     <w:p>
       <w:r>
-        <w:t>relational</w:t>
-      </w:r>
+        <w:t>per env), so pointing DEV / UAT / PROD at their own Oracle is a per-env *secret*, not a code change.</w:t>
+      </w:r>
+    </w:p>
+    <w:p>
+      <w:r>
+        <w:t xml:space="preserve">Promotion is </w:t>
+      </w:r>
+      <w:r>
+        <w:rPr>
+          <w:rFonts w:ascii="Consolas" w:hAnsi="Consolas"/>
+          <w:color w:val="A31F34"/>
+        </w:rPr>
+        <w:t>git → cp_bootstrap/cp_config</w:t>
+      </w:r>
+      <w:r>
+        <w:t xml:space="preserve"> per environment: **ingestion, transformation, DQ, gold,</w:t>
+      </w:r>
+    </w:p>
+    <w:p>
+      <w:r>
+        <w:t>and security move together**, versioned and diffable, with no portal clicks.</w:t>
+      </w:r>
+    </w:p>
+    <w:p>
       <w:r>
         <w:rPr>
           <w:b/>
         </w:rPr>
-        <w:t xml:space="preserve"> (PK/unique index, supported types, no LOBs); the DBA </w:t>
-      </w:r>
-      <w:r>
-        <w:t>can and will enable CDC**; and</w:t>
+        <w:t>Mirroring — the replica config promotes; the rest is per-env manual.</w:t>
+      </w:r>
+      <w:r>
+        <w:t xml:space="preserve"> Mirrored databases *do*</w:t>
       </w:r>
     </w:p>
     <w:p>
+      <w:r>
+        <w:t>support Git integration and deployment pipelines now — but with real seams that add up per stage:</w:t>
+      </w:r>
+    </w:p>
+    <w:p>
+      <w:pPr>
+        <w:pStyle w:val="ListBullet"/>
+        <w:ind w:left="360"/>
+      </w:pPr>
       <w:r>
         <w:rPr>
           <w:b/>
         </w:rPr>
-        <w:t>little/no transformation or masking is required at bronze</w:t>
-      </w:r>
-      <w:r>
-        <w:t>. Typical fit: a handful of</w:t>
+        <w:t>Only the mirror item is tracked in Git</w:t>
+      </w:r>
+      <w:r>
+        <w:t xml:space="preserve"> (</w:t>
+      </w:r>
+      <w:r>
+        <w:rPr>
+          <w:rFonts w:ascii="Consolas" w:hAnsi="Consolas"/>
+          <w:color w:val="A31F34"/>
+        </w:rPr>
+        <w:t>mirroring.json</w:t>
+      </w:r>
+      <w:r>
+        <w:t xml:space="preserve"> = the table selection). The</w:t>
       </w:r>
     </w:p>
     <w:p>
       <w:r>
-        <w:t>high-value operational tables for live dashboards.</w:t>
-      </w:r>
-    </w:p>
-    <w:p>
+        <w:t xml:space="preserve">  </w:t>
+      </w:r>
       <w:r>
         <w:rPr>
           <w:b/>
         </w:rPr>
-        <w:t>Lean our framework when</w:t>
-      </w:r>
-      <w:r>
-        <w:t xml:space="preserve"> any hold: you must </w:t>
+        <w:t>connection, credentials, gateway, SQL analytics endpoint, and any views are *not* tracked</w:t>
+      </w:r>
+      <w:r>
+        <w:t>.</w:t>
+      </w:r>
+    </w:p>
+    <w:p>
+      <w:pPr>
+        <w:pStyle w:val="ListBullet"/>
+        <w:ind w:left="360"/>
+      </w:pPr>
+      <w:r>
+        <w:t xml:space="preserve">Deploying to a stage needs a </w:t>
       </w:r>
       <w:r>
         <w:rPr>
           <w:b/>
         </w:rPr>
-        <w:t>subset, type, mask, or DQ-gate at ingest</w:t>
+        <w:t>deployment rule</w:t>
+      </w:r>
+      <w:r>
+        <w:t xml:space="preserve"> to rebind the mirror to *that* environment's</w:t>
       </w:r>
     </w:p>
     <w:p>
       <w:r>
-        <w:t xml:space="preserve">(sensitive data); the source </w:t>
+        <w:t xml:space="preserve">  </w:t>
       </w:r>
       <w:r>
         <w:rPr>
           <w:b/>
         </w:rPr>
-        <w:t>can't take CDC changes</w:t>
-      </w:r>
-      <w:r>
-        <w:t xml:space="preserve"> or is a non-mirrorable type/shape; you need</w:t>
+        <w:t>source connection ID</w:t>
+      </w:r>
+      <w:r>
+        <w:t xml:space="preserve"> — so you first create the env's gateway connection, then wire the rule.</w:t>
       </w:r>
     </w:p>
     <w:p>
+      <w:pPr>
+        <w:pStyle w:val="ListBullet"/>
+        <w:ind w:left="360"/>
+      </w:pPr>
+      <w:r>
+        <w:t xml:space="preserve">The mirror </w:t>
+      </w:r>
       <w:r>
         <w:rPr>
           <w:b/>
         </w:rPr>
-        <w:t>one pattern across heterogeneous sources</w:t>
-      </w:r>
-      <w:r>
-        <w:t xml:space="preserve"> (Oracle + APIs + files); </w:t>
+        <w:t>isn't started after deployment</w:t>
+      </w:r>
+      <w:r>
+        <w:t xml:space="preserve"> — you start it manually (or via API) in each env,</w:t>
+      </w:r>
+    </w:p>
+    <w:p>
+      <w:r>
+        <w:t xml:space="preserve">  which triggers a </w:t>
       </w:r>
       <w:r>
         <w:rPr>
           <w:b/>
         </w:rPr>
-        <w:t>batch latency is acceptable</w:t>
+        <w:t>full re-seed</w:t>
+      </w:r>
+      <w:r>
+        <w:t xml:space="preserve"> (fresh initial copy) from that environment's source.</w:t>
       </w:r>
     </w:p>
     <w:p>
-      <w:r>
-        <w:t xml:space="preserve">(most pension analytics); or you want </w:t>
+      <w:pPr>
+        <w:pStyle w:val="ListBullet"/>
+        <w:ind w:left="360"/>
+      </w:pPr>
+      <w:r>
+        <w:t xml:space="preserve">The </w:t>
       </w:r>
       <w:r>
         <w:rPr>
           <w:b/>
         </w:rPr>
-        <w:t>config-as-code promotion and lineage</w:t>
-      </w:r>
-      <w:r>
-        <w:t>.</w:t>
+        <w:t>source-side CDC prerequisites</w:t>
+      </w:r>
+      <w:r>
+        <w:t xml:space="preserve"> (ARCHIVELOG, LogMiner, supplemental logging, grants) must be</w:t>
+      </w:r>
+    </w:p>
+    <w:p>
+      <w:r>
+        <w:t xml:space="preserve">  enabled by the DBA on </w:t>
+      </w:r>
+      <w:r>
+        <w:rPr>
+          <w:b/>
+        </w:rPr>
+        <w:t>each</w:t>
+      </w:r>
+      <w:r>
+        <w:t xml:space="preserve"> environment's Oracle — that isn't deployable at all.</w:t>
+      </w:r>
+    </w:p>
+    <w:p>
+      <w:pPr>
+        <w:pStyle w:val="ListBullet"/>
+        <w:ind w:left="360"/>
+      </w:pPr>
+      <w:r>
+        <w:rPr>
+          <w:b/>
+        </w:rPr>
+        <w:t>Downstream objects aren't promoted with the mirror</w:t>
+      </w:r>
+      <w:r>
+        <w:t xml:space="preserve"> — SQL-endpoint views (and of course your</w:t>
+      </w:r>
+    </w:p>
+    <w:p>
+      <w:r>
+        <w:t xml:space="preserve">  silver/gold and security) are a separate ALM track.</w:t>
+      </w:r>
+    </w:p>
+    <w:p>
+      <w:r>
+        <w:rPr>
+          <w:b/>
+        </w:rPr>
+        <w:t>Net:</w:t>
+      </w:r>
+      <w:r>
+        <w:t xml:space="preserve"> mirroring's CI/CD moves *which tables to replicate*, but per environment you still create a</w:t>
+      </w:r>
+    </w:p>
+    <w:p>
+      <w:r>
+        <w:t xml:space="preserve">connection, add a deployment rule, get the DBA to enable CDC on that Oracle, </w:t>
+      </w:r>
+      <w:r>
+        <w:rPr>
+          <w:b/>
+        </w:rPr>
+        <w:t>start</w:t>
+      </w:r>
+      <w:r>
+        <w:t xml:space="preserve"> the mirror,</w:t>
+      </w:r>
+    </w:p>
+    <w:p>
+      <w:r>
+        <w:t xml:space="preserve">and wait out a </w:t>
+      </w:r>
+      <w:r>
+        <w:rPr>
+          <w:b/>
+        </w:rPr>
+        <w:t>re-seed</w:t>
+      </w:r>
+      <w:r>
+        <w:t xml:space="preserve"> — then promote your silver/gold/security </w:t>
+      </w:r>
+      <w:r>
+        <w:rPr>
+          <w:b/>
+        </w:rPr>
+        <w:t>separately</w:t>
+      </w:r>
+      <w:r>
+        <w:t>. The framework</w:t>
+      </w:r>
+    </w:p>
+    <w:p>
+      <w:r>
+        <w:t xml:space="preserve">promotes the whole pipeline, raw acquisition through governed gold, as a </w:t>
+      </w:r>
+      <w:r>
+        <w:rPr>
+          <w:b/>
+        </w:rPr>
+        <w:t>single</w:t>
+      </w:r>
+      <w:r>
+        <w:t xml:space="preserve"> config-as-code</w:t>
+      </w:r>
+    </w:p>
+    <w:p>
+      <w:r>
+        <w:t>artifact. For a three-environment pension estate, that difference is the gap between one repeatable</w:t>
+      </w:r>
+    </w:p>
+    <w:p>
+      <w:r>
+        <w:rPr>
+          <w:rFonts w:ascii="Consolas" w:hAnsi="Consolas"/>
+          <w:color w:val="A31F34"/>
+        </w:rPr>
+        <w:t>cp_config</w:t>
+      </w:r>
+      <w:r>
+        <w:t xml:space="preserve"> run and a portal-plus-DBA checklist repeated in each workspace.</w:t>
       </w:r>
     </w:p>
     <w:p>
@@ -2000,7 +2307,128 @@
       </w:pPr>
       <w:r/>
       <w:r>
-        <w:t>5. Recommendation for BCPC</w:t>
+        <w:t>5. When to choose which</w:t>
+      </w:r>
+    </w:p>
+    <w:p>
+      <w:r>
+        <w:rPr>
+          <w:b/>
+        </w:rPr>
+        <w:t>Lean Mirroring when</w:t>
+      </w:r>
+      <w:r>
+        <w:t xml:space="preserve"> *all* hold: the table needs </w:t>
+      </w:r>
+      <w:r>
+        <w:rPr>
+          <w:b/>
+        </w:rPr>
+        <w:t>near-real-time</w:t>
+      </w:r>
+      <w:r>
+        <w:t xml:space="preserve"> freshness; it's **cleanly</w:t>
+      </w:r>
+    </w:p>
+    <w:p>
+      <w:r>
+        <w:t>relational</w:t>
+      </w:r>
+      <w:r>
+        <w:rPr>
+          <w:b/>
+        </w:rPr>
+        <w:t xml:space="preserve"> (PK/unique index, supported types, no LOBs); the DBA </w:t>
+      </w:r>
+      <w:r>
+        <w:t>can and will enable CDC**; and</w:t>
+      </w:r>
+    </w:p>
+    <w:p>
+      <w:r>
+        <w:rPr>
+          <w:b/>
+        </w:rPr>
+        <w:t>little/no transformation or masking is required at bronze</w:t>
+      </w:r>
+      <w:r>
+        <w:t>. Typical fit: a handful of</w:t>
+      </w:r>
+    </w:p>
+    <w:p>
+      <w:r>
+        <w:t>high-value operational tables for live dashboards.</w:t>
+      </w:r>
+    </w:p>
+    <w:p>
+      <w:r>
+        <w:rPr>
+          <w:b/>
+        </w:rPr>
+        <w:t>Lean our framework when</w:t>
+      </w:r>
+      <w:r>
+        <w:t xml:space="preserve"> any hold: you must </w:t>
+      </w:r>
+      <w:r>
+        <w:rPr>
+          <w:b/>
+        </w:rPr>
+        <w:t>subset, type, mask, or DQ-gate at ingest</w:t>
+      </w:r>
+    </w:p>
+    <w:p>
+      <w:r>
+        <w:t xml:space="preserve">(sensitive data); the source </w:t>
+      </w:r>
+      <w:r>
+        <w:rPr>
+          <w:b/>
+        </w:rPr>
+        <w:t>can't take CDC changes</w:t>
+      </w:r>
+      <w:r>
+        <w:t xml:space="preserve"> or is a non-mirrorable type/shape; you need</w:t>
+      </w:r>
+    </w:p>
+    <w:p>
+      <w:r>
+        <w:rPr>
+          <w:b/>
+        </w:rPr>
+        <w:t>one pattern across heterogeneous sources</w:t>
+      </w:r>
+      <w:r>
+        <w:t xml:space="preserve"> (Oracle + APIs + files); </w:t>
+      </w:r>
+      <w:r>
+        <w:rPr>
+          <w:b/>
+        </w:rPr>
+        <w:t>batch latency is acceptable</w:t>
+      </w:r>
+    </w:p>
+    <w:p>
+      <w:r>
+        <w:t xml:space="preserve">(most pension analytics); or you want </w:t>
+      </w:r>
+      <w:r>
+        <w:rPr>
+          <w:b/>
+        </w:rPr>
+        <w:t>config-as-code promotion and lineage</w:t>
+      </w:r>
+      <w:r>
+        <w:t>.</w:t>
+      </w:r>
+    </w:p>
+    <w:p>
+      <w:pPr>
+        <w:pStyle w:val="Heading2"/>
+      </w:pPr>
+      <w:r/>
+      <w:r>
+        <w:t>6. Recommendation for BCPC</w:t>
       </w:r>
     </w:p>
     <w:p>
@@ -2135,6 +2563,30 @@
     <w:p>
       <w:r>
         <w:t xml:space="preserve">   event-triggered batch meets the need.</w:t>
+      </w:r>
+    </w:p>
+    <w:p>
+      <w:r>
+        <w:t xml:space="preserve">6. </w:t>
+      </w:r>
+      <w:r>
+        <w:rPr>
+          <w:b/>
+        </w:rPr>
+        <w:t>Simpler promotion (§4).</w:t>
+      </w:r>
+      <w:r>
+        <w:t xml:space="preserve"> The whole medallion promotes as one config-as-code unit; mirroring</w:t>
+      </w:r>
+    </w:p>
+    <w:p>
+      <w:r>
+        <w:t xml:space="preserve">   promotes only the replica config and leaves per-env connections, DBA CDC enablement, manual</w:t>
+      </w:r>
+    </w:p>
+    <w:p>
+      <w:r>
+        <w:t xml:space="preserve">   start, and re-seed as a checklist repeated in each workspace.</w:t>
       </w:r>
     </w:p>
     <w:p>
@@ -2238,6 +2690,18 @@
           <w:u w:val="single"/>
         </w:rPr>
         <w:t>Oracle mirroring limitations</w:t>
+      </w:r>
+      <w:r>
+        <w:t xml:space="preserve"> ·</w:t>
+      </w:r>
+    </w:p>
+    <w:p>
+      <w:r>
+        <w:rPr>
+          <w:color w:val="1A5FB4"/>
+          <w:u w:val="single"/>
+        </w:rPr>
+        <w:t>CI/CD for mirrored databases</w:t>
       </w:r>
       <w:r>
         <w:t xml:space="preserve"> ·</w:t>

</xml_diff>

<commit_message>
BRONZE_VS_MIRRORING: add scenario-by-scenario source-change comparison (insert/update/delete/DDL)
</commit_message>
<xml_diff>
--- a/control_plane/docs/BRONZE_VS_MIRRORING.docx
+++ b/control_plane/docs/BRONZE_VS_MIRRORING.docx
@@ -1296,7 +1296,7 @@
               <w:rPr>
                 <w:sz w:val="18"/>
               </w:rPr>
-              <w:t>, and views are per-env manual (see §4)</w:t>
+              <w:t>, and views are per-env manual (see §5)</w:t>
             </w:r>
           </w:p>
         </w:tc>
@@ -1525,7 +1525,1138 @@
       </w:pPr>
       <w:r/>
       <w:r>
-        <w:t>3. Pros &amp; cons</w:t>
+        <w:t>3. Scenario by scenario — what happens when the source changes</w:t>
+      </w:r>
+    </w:p>
+    <w:p>
+      <w:r>
+        <w:t>Follow a single row through both paths. *Mirrored bronze* = the live replica; *Framework* = our</w:t>
+      </w:r>
+    </w:p>
+    <w:p>
+      <w:r>
+        <w:t>connector → bronze → silver → gold.</w:t>
+      </w:r>
+    </w:p>
+    <w:tbl>
+      <w:tblPr>
+        <w:tblStyle w:val="LightGrid-Accent1"/>
+        <w:tblW w:type="auto" w:w="0"/>
+        <w:tblLook w:firstColumn="1" w:firstRow="1" w:lastColumn="0" w:lastRow="0" w:noHBand="0" w:noVBand="1" w:val="04A0"/>
+      </w:tblPr>
+      <w:tblGrid>
+        <w:gridCol w:w="2880"/>
+        <w:gridCol w:w="2880"/>
+        <w:gridCol w:w="2880"/>
+      </w:tblGrid>
+      <w:tr>
+        <w:tc>
+          <w:tcPr>
+            <w:tcW w:type="dxa" w:w="2880"/>
+          </w:tcPr>
+          <w:p>
+            <w:r>
+              <w:rPr>
+                <w:b/>
+                <w:sz w:val="18"/>
+              </w:rPr>
+            </w:r>
+            <w:r>
+              <w:rPr>
+                <w:b/>
+                <w:sz w:val="18"/>
+              </w:rPr>
+              <w:t>Source event</w:t>
+            </w:r>
+          </w:p>
+        </w:tc>
+        <w:tc>
+          <w:tcPr>
+            <w:tcW w:type="dxa" w:w="2880"/>
+          </w:tcPr>
+          <w:p>
+            <w:r>
+              <w:rPr>
+                <w:b/>
+                <w:sz w:val="18"/>
+              </w:rPr>
+            </w:r>
+            <w:r>
+              <w:rPr>
+                <w:b/>
+                <w:sz w:val="18"/>
+              </w:rPr>
+              <w:t>Mirrored bronze</w:t>
+            </w:r>
+          </w:p>
+        </w:tc>
+        <w:tc>
+          <w:tcPr>
+            <w:tcW w:type="dxa" w:w="2880"/>
+          </w:tcPr>
+          <w:p>
+            <w:r>
+              <w:rPr>
+                <w:b/>
+                <w:sz w:val="18"/>
+              </w:rPr>
+            </w:r>
+            <w:r>
+              <w:rPr>
+                <w:b/>
+                <w:sz w:val="18"/>
+              </w:rPr>
+              <w:t>Our framework</w:t>
+            </w:r>
+          </w:p>
+        </w:tc>
+      </w:tr>
+      <w:tr>
+        <w:tc>
+          <w:tcPr>
+            <w:tcW w:type="dxa" w:w="2880"/>
+          </w:tcPr>
+          <w:p>
+            <w:r>
+              <w:rPr>
+                <w:sz w:val="18"/>
+              </w:rPr>
+            </w:r>
+            <w:r>
+              <w:rPr>
+                <w:b/>
+                <w:sz w:val="18"/>
+              </w:rPr>
+              <w:t>Row inserted</w:t>
+            </w:r>
+          </w:p>
+        </w:tc>
+        <w:tc>
+          <w:tcPr>
+            <w:tcW w:type="dxa" w:w="2880"/>
+          </w:tcPr>
+          <w:p>
+            <w:r>
+              <w:rPr>
+                <w:sz w:val="18"/>
+              </w:rPr>
+            </w:r>
+            <w:r>
+              <w:rPr>
+                <w:sz w:val="18"/>
+              </w:rPr>
+              <w:t>Appears in the mirror in ~seconds (CDC)</w:t>
+            </w:r>
+          </w:p>
+        </w:tc>
+        <w:tc>
+          <w:tcPr>
+            <w:tcW w:type="dxa" w:w="2880"/>
+          </w:tcPr>
+          <w:p>
+            <w:r>
+              <w:rPr>
+                <w:sz w:val="18"/>
+              </w:rPr>
+            </w:r>
+            <w:r>
+              <w:rPr>
+                <w:sz w:val="18"/>
+              </w:rPr>
+              <w:t>Picked up on the next run (watermark: when its change-date advances; else next full load); silver keys it, gold adds it</w:t>
+            </w:r>
+          </w:p>
+        </w:tc>
+      </w:tr>
+      <w:tr>
+        <w:tc>
+          <w:tcPr>
+            <w:tcW w:type="dxa" w:w="2880"/>
+          </w:tcPr>
+          <w:p>
+            <w:r>
+              <w:rPr>
+                <w:sz w:val="18"/>
+              </w:rPr>
+            </w:r>
+            <w:r>
+              <w:rPr>
+                <w:b/>
+                <w:sz w:val="18"/>
+              </w:rPr>
+              <w:t>Row updated</w:t>
+            </w:r>
+          </w:p>
+        </w:tc>
+        <w:tc>
+          <w:tcPr>
+            <w:tcW w:type="dxa" w:w="2880"/>
+          </w:tcPr>
+          <w:p>
+            <w:r>
+              <w:rPr>
+                <w:sz w:val="18"/>
+              </w:rPr>
+            </w:r>
+            <w:r>
+              <w:rPr>
+                <w:sz w:val="18"/>
+              </w:rPr>
+              <w:t xml:space="preserve">Mirror row updated in place — shows the </w:t>
+            </w:r>
+            <w:r>
+              <w:rPr>
+                <w:b/>
+                <w:sz w:val="18"/>
+              </w:rPr>
+              <w:t>new</w:t>
+            </w:r>
+            <w:r>
+              <w:rPr>
+                <w:sz w:val="18"/>
+              </w:rPr>
+              <w:t xml:space="preserve"> value; the old value is </w:t>
+            </w:r>
+            <w:r>
+              <w:rPr>
+                <w:b/>
+                <w:sz w:val="18"/>
+              </w:rPr>
+              <w:t>gone</w:t>
+            </w:r>
+            <w:r>
+              <w:rPr>
+                <w:sz w:val="18"/>
+              </w:rPr>
+              <w:t xml:space="preserve"> (mirror = current state)</w:t>
+            </w:r>
+          </w:p>
+        </w:tc>
+        <w:tc>
+          <w:tcPr>
+            <w:tcW w:type="dxa" w:w="2880"/>
+          </w:tcPr>
+          <w:p>
+            <w:r>
+              <w:rPr>
+                <w:sz w:val="18"/>
+              </w:rPr>
+            </w:r>
+            <w:r>
+              <w:rPr>
+                <w:sz w:val="18"/>
+              </w:rPr>
+              <w:t xml:space="preserve">Incremental appends the new version to bronze (a raw change log); silver keeps latest by key; </w:t>
+            </w:r>
+            <w:r>
+              <w:rPr>
+                <w:b/>
+                <w:sz w:val="18"/>
+              </w:rPr>
+              <w:t>gold SCD2 preserves old *and* new</w:t>
+            </w:r>
+            <w:r>
+              <w:rPr>
+                <w:sz w:val="18"/>
+              </w:rPr>
+              <w:t xml:space="preserve"> — you keep history</w:t>
+            </w:r>
+          </w:p>
+        </w:tc>
+      </w:tr>
+      <w:tr>
+        <w:tc>
+          <w:tcPr>
+            <w:tcW w:type="dxa" w:w="2880"/>
+          </w:tcPr>
+          <w:p>
+            <w:r>
+              <w:rPr>
+                <w:sz w:val="18"/>
+              </w:rPr>
+            </w:r>
+            <w:r>
+              <w:rPr>
+                <w:b/>
+                <w:sz w:val="18"/>
+              </w:rPr>
+              <w:t>Row deleted</w:t>
+            </w:r>
+          </w:p>
+        </w:tc>
+        <w:tc>
+          <w:tcPr>
+            <w:tcW w:type="dxa" w:w="2880"/>
+          </w:tcPr>
+          <w:p>
+            <w:r>
+              <w:rPr>
+                <w:sz w:val="18"/>
+              </w:rPr>
+            </w:r>
+            <w:r>
+              <w:rPr>
+                <w:sz w:val="18"/>
+              </w:rPr>
+              <w:t xml:space="preserve">CDC </w:t>
+            </w:r>
+            <w:r>
+              <w:rPr>
+                <w:b/>
+                <w:sz w:val="18"/>
+              </w:rPr>
+              <w:t>removes</w:t>
+            </w:r>
+            <w:r>
+              <w:rPr>
+                <w:sz w:val="18"/>
+              </w:rPr>
+              <w:t xml:space="preserve"> the row from the mirror — deletions propagate natively</w:t>
+            </w:r>
+          </w:p>
+        </w:tc>
+        <w:tc>
+          <w:tcPr>
+            <w:tcW w:type="dxa" w:w="2880"/>
+          </w:tcPr>
+          <w:p>
+            <w:r>
+              <w:rPr>
+                <w:sz w:val="18"/>
+              </w:rPr>
+            </w:r>
+            <w:r>
+              <w:rPr>
+                <w:b/>
+                <w:sz w:val="18"/>
+              </w:rPr>
+              <w:t>Weak spot:</w:t>
+            </w:r>
+            <w:r>
+              <w:rPr>
+                <w:sz w:val="18"/>
+              </w:rPr>
+              <w:t xml:space="preserve"> a watermark </w:t>
+            </w:r>
+            <w:r>
+              <w:rPr>
+                <w:b/>
+                <w:sz w:val="18"/>
+              </w:rPr>
+              <w:t>can't see deletes</w:t>
+            </w:r>
+            <w:r>
+              <w:rPr>
+                <w:sz w:val="18"/>
+              </w:rPr>
+              <w:t xml:space="preserve"> (a delete doesn't bump a change-date) and silver's key-merge doesn't remove absent rows. Reflecting deletes needs a full-snapshot overwrite or a key-set </w:t>
+            </w:r>
+            <w:r>
+              <w:rPr>
+                <w:b/>
+                <w:sz w:val="18"/>
+              </w:rPr>
+              <w:t>reconciliation</w:t>
+            </w:r>
+            <w:r>
+              <w:rPr>
+                <w:sz w:val="18"/>
+              </w:rPr>
+              <w:t xml:space="preserve"> (soft-delete flag) — an enhancement, not out-of-the-box</w:t>
+            </w:r>
+          </w:p>
+        </w:tc>
+      </w:tr>
+      <w:tr>
+        <w:tc>
+          <w:tcPr>
+            <w:tcW w:type="dxa" w:w="2880"/>
+          </w:tcPr>
+          <w:p>
+            <w:r>
+              <w:rPr>
+                <w:sz w:val="18"/>
+              </w:rPr>
+            </w:r>
+            <w:r>
+              <w:rPr>
+                <w:b/>
+                <w:sz w:val="18"/>
+              </w:rPr>
+              <w:t>Column added</w:t>
+            </w:r>
+          </w:p>
+        </w:tc>
+        <w:tc>
+          <w:tcPr>
+            <w:tcW w:type="dxa" w:w="2880"/>
+          </w:tcPr>
+          <w:p>
+            <w:r>
+              <w:rPr>
+                <w:sz w:val="18"/>
+              </w:rPr>
+            </w:r>
+            <w:r>
+              <w:rPr>
+                <w:sz w:val="18"/>
+              </w:rPr>
+              <w:t>Applied (supported DDL)</w:t>
+            </w:r>
+          </w:p>
+        </w:tc>
+        <w:tc>
+          <w:tcPr>
+            <w:tcW w:type="dxa" w:w="2880"/>
+          </w:tcPr>
+          <w:p>
+            <w:r>
+              <w:rPr>
+                <w:sz w:val="18"/>
+              </w:rPr>
+            </w:r>
+            <w:r>
+              <w:rPr>
+                <w:sz w:val="18"/>
+              </w:rPr>
+              <w:t xml:space="preserve">Full load picks it up; silver </w:t>
+            </w:r>
+            <w:r>
+              <w:rPr>
+                <w:b/>
+                <w:sz w:val="18"/>
+              </w:rPr>
+              <w:t>logs a `COLUMN_ADDED` drift event</w:t>
+            </w:r>
+            <w:r>
+              <w:rPr>
+                <w:sz w:val="18"/>
+              </w:rPr>
+              <w:t xml:space="preserve">; flows unless </w:t>
+            </w:r>
+            <w:r>
+              <w:rPr>
+                <w:rFonts w:ascii="Consolas" w:hAnsi="Consolas"/>
+                <w:color w:val="A31F34"/>
+                <w:sz w:val="18"/>
+              </w:rPr>
+              <w:t>select</w:t>
+            </w:r>
+            <w:r>
+              <w:rPr>
+                <w:sz w:val="18"/>
+              </w:rPr>
+              <w:t xml:space="preserve"> excludes it</w:t>
+            </w:r>
+          </w:p>
+        </w:tc>
+      </w:tr>
+      <w:tr>
+        <w:tc>
+          <w:tcPr>
+            <w:tcW w:type="dxa" w:w="2880"/>
+          </w:tcPr>
+          <w:p>
+            <w:r>
+              <w:rPr>
+                <w:sz w:val="18"/>
+              </w:rPr>
+            </w:r>
+            <w:r>
+              <w:rPr>
+                <w:b/>
+                <w:sz w:val="18"/>
+              </w:rPr>
+              <w:t>Column dropped</w:t>
+            </w:r>
+          </w:p>
+        </w:tc>
+        <w:tc>
+          <w:tcPr>
+            <w:tcW w:type="dxa" w:w="2880"/>
+          </w:tcPr>
+          <w:p>
+            <w:r>
+              <w:rPr>
+                <w:sz w:val="18"/>
+              </w:rPr>
+            </w:r>
+            <w:r>
+              <w:rPr>
+                <w:sz w:val="18"/>
+              </w:rPr>
+              <w:t>Applied (supported DDL)</w:t>
+            </w:r>
+          </w:p>
+        </w:tc>
+        <w:tc>
+          <w:tcPr>
+            <w:tcW w:type="dxa" w:w="2880"/>
+          </w:tcPr>
+          <w:p>
+            <w:r>
+              <w:rPr>
+                <w:sz w:val="18"/>
+              </w:rPr>
+            </w:r>
+            <w:r>
+              <w:rPr>
+                <w:sz w:val="18"/>
+              </w:rPr>
+              <w:t xml:space="preserve">Absent next load; silver </w:t>
+            </w:r>
+            <w:r>
+              <w:rPr>
+                <w:b/>
+                <w:sz w:val="18"/>
+              </w:rPr>
+              <w:t>logs `COLUMN_REMOVED`</w:t>
+            </w:r>
+            <w:r>
+              <w:rPr>
+                <w:sz w:val="18"/>
+              </w:rPr>
+              <w:t xml:space="preserve"> (warning)</w:t>
+            </w:r>
+          </w:p>
+        </w:tc>
+      </w:tr>
+      <w:tr>
+        <w:tc>
+          <w:tcPr>
+            <w:tcW w:type="dxa" w:w="2880"/>
+          </w:tcPr>
+          <w:p>
+            <w:r>
+              <w:rPr>
+                <w:sz w:val="18"/>
+              </w:rPr>
+            </w:r>
+            <w:r>
+              <w:rPr>
+                <w:b/>
+                <w:sz w:val="18"/>
+              </w:rPr>
+              <w:t>Column renamed</w:t>
+            </w:r>
+          </w:p>
+        </w:tc>
+        <w:tc>
+          <w:tcPr>
+            <w:tcW w:type="dxa" w:w="2880"/>
+          </w:tcPr>
+          <w:p>
+            <w:r>
+              <w:rPr>
+                <w:sz w:val="18"/>
+              </w:rPr>
+            </w:r>
+            <w:r>
+              <w:rPr>
+                <w:sz w:val="18"/>
+              </w:rPr>
+              <w:t>Applied (supported DDL)</w:t>
+            </w:r>
+          </w:p>
+        </w:tc>
+        <w:tc>
+          <w:tcPr>
+            <w:tcW w:type="dxa" w:w="2880"/>
+          </w:tcPr>
+          <w:p>
+            <w:r>
+              <w:rPr>
+                <w:sz w:val="18"/>
+              </w:rPr>
+            </w:r>
+            <w:r>
+              <w:rPr>
+                <w:sz w:val="18"/>
+              </w:rPr>
+              <w:t xml:space="preserve">Shows as drop+add (drift logged); a </w:t>
+            </w:r>
+            <w:r>
+              <w:rPr>
+                <w:rFonts w:ascii="Consolas" w:hAnsi="Consolas"/>
+                <w:color w:val="A31F34"/>
+                <w:sz w:val="18"/>
+              </w:rPr>
+              <w:t>select</w:t>
+            </w:r>
+            <w:r>
+              <w:rPr>
+                <w:sz w:val="18"/>
+              </w:rPr>
+              <w:t xml:space="preserve"> rename normalizes it</w:t>
+            </w:r>
+          </w:p>
+        </w:tc>
+      </w:tr>
+      <w:tr>
+        <w:tc>
+          <w:tcPr>
+            <w:tcW w:type="dxa" w:w="2880"/>
+          </w:tcPr>
+          <w:p>
+            <w:r>
+              <w:rPr>
+                <w:sz w:val="18"/>
+              </w:rPr>
+            </w:r>
+            <w:r>
+              <w:rPr>
+                <w:b/>
+                <w:sz w:val="18"/>
+              </w:rPr>
+              <w:t>Column *type* changed</w:t>
+            </w:r>
+          </w:p>
+        </w:tc>
+        <w:tc>
+          <w:tcPr>
+            <w:tcW w:type="dxa" w:w="2880"/>
+          </w:tcPr>
+          <w:p>
+            <w:r>
+              <w:rPr>
+                <w:sz w:val="18"/>
+              </w:rPr>
+            </w:r>
+            <w:r>
+              <w:rPr>
+                <w:b/>
+                <w:sz w:val="18"/>
+              </w:rPr>
+              <w:t>Not supported</w:t>
+            </w:r>
+            <w:r>
+              <w:rPr>
+                <w:sz w:val="18"/>
+              </w:rPr>
+              <w:t xml:space="preserve"> — mirroring can fail that table</w:t>
+            </w:r>
+          </w:p>
+        </w:tc>
+        <w:tc>
+          <w:tcPr>
+            <w:tcW w:type="dxa" w:w="2880"/>
+          </w:tcPr>
+          <w:p>
+            <w:r>
+              <w:rPr>
+                <w:sz w:val="18"/>
+              </w:rPr>
+            </w:r>
+            <w:r>
+              <w:rPr>
+                <w:sz w:val="18"/>
+              </w:rPr>
+              <w:t xml:space="preserve">Schema-on-read tolerates it (lands as-is); a </w:t>
+            </w:r>
+            <w:r>
+              <w:rPr>
+                <w:rFonts w:ascii="Consolas" w:hAnsi="Consolas"/>
+                <w:color w:val="A31F34"/>
+                <w:sz w:val="18"/>
+              </w:rPr>
+              <w:t>cleanse</w:t>
+            </w:r>
+            <w:r>
+              <w:rPr>
+                <w:sz w:val="18"/>
+              </w:rPr>
+              <w:t xml:space="preserve"> cast fixes it</w:t>
+            </w:r>
+          </w:p>
+        </w:tc>
+      </w:tr>
+      <w:tr>
+        <w:tc>
+          <w:tcPr>
+            <w:tcW w:type="dxa" w:w="2880"/>
+          </w:tcPr>
+          <w:p>
+            <w:r>
+              <w:rPr>
+                <w:sz w:val="18"/>
+              </w:rPr>
+            </w:r>
+            <w:r>
+              <w:rPr>
+                <w:b/>
+                <w:sz w:val="18"/>
+              </w:rPr>
+              <w:t>New table added</w:t>
+            </w:r>
+          </w:p>
+        </w:tc>
+        <w:tc>
+          <w:tcPr>
+            <w:tcW w:type="dxa" w:w="2880"/>
+          </w:tcPr>
+          <w:p>
+            <w:r>
+              <w:rPr>
+                <w:sz w:val="18"/>
+              </w:rPr>
+            </w:r>
+            <w:r>
+              <w:rPr>
+                <w:sz w:val="18"/>
+              </w:rPr>
+              <w:t>Reconfigure the mirror to include it</w:t>
+            </w:r>
+          </w:p>
+        </w:tc>
+        <w:tc>
+          <w:tcPr>
+            <w:tcW w:type="dxa" w:w="2880"/>
+          </w:tcPr>
+          <w:p>
+            <w:r>
+              <w:rPr>
+                <w:sz w:val="18"/>
+              </w:rPr>
+            </w:r>
+            <w:r>
+              <w:rPr>
+                <w:sz w:val="18"/>
+              </w:rPr>
+              <w:t xml:space="preserve">Discovery registers it </w:t>
+            </w:r>
+            <w:r>
+              <w:rPr>
+                <w:rFonts w:ascii="Consolas" w:hAnsi="Consolas"/>
+                <w:color w:val="A31F34"/>
+                <w:sz w:val="18"/>
+              </w:rPr>
+              <w:t>is_active=0</w:t>
+            </w:r>
+            <w:r>
+              <w:rPr>
+                <w:sz w:val="18"/>
+              </w:rPr>
+              <w:t>; review + activate (config-as-code)</w:t>
+            </w:r>
+          </w:p>
+        </w:tc>
+      </w:tr>
+      <w:tr>
+        <w:tc>
+          <w:tcPr>
+            <w:tcW w:type="dxa" w:w="2880"/>
+          </w:tcPr>
+          <w:p>
+            <w:r>
+              <w:rPr>
+                <w:sz w:val="18"/>
+              </w:rPr>
+            </w:r>
+            <w:r>
+              <w:rPr>
+                <w:b/>
+                <w:sz w:val="18"/>
+              </w:rPr>
+              <w:t>Bulk truncate + reload</w:t>
+            </w:r>
+          </w:p>
+        </w:tc>
+        <w:tc>
+          <w:tcPr>
+            <w:tcW w:type="dxa" w:w="2880"/>
+          </w:tcPr>
+          <w:p>
+            <w:r>
+              <w:rPr>
+                <w:sz w:val="18"/>
+              </w:rPr>
+            </w:r>
+            <w:r>
+              <w:rPr>
+                <w:sz w:val="18"/>
+              </w:rPr>
+              <w:t>CDC reflects it, but large re-seeds spike gateway memory</w:t>
+            </w:r>
+          </w:p>
+        </w:tc>
+        <w:tc>
+          <w:tcPr>
+            <w:tcW w:type="dxa" w:w="2880"/>
+          </w:tcPr>
+          <w:p>
+            <w:r>
+              <w:rPr>
+                <w:sz w:val="18"/>
+              </w:rPr>
+            </w:r>
+            <w:r>
+              <w:rPr>
+                <w:sz w:val="18"/>
+              </w:rPr>
+              <w:t>Full load reflects it; incremental picks up rows whose change-date advanced</w:t>
+            </w:r>
+          </w:p>
+        </w:tc>
+      </w:tr>
+      <w:tr>
+        <w:tc>
+          <w:tcPr>
+            <w:tcW w:type="dxa" w:w="2880"/>
+          </w:tcPr>
+          <w:p>
+            <w:r>
+              <w:rPr>
+                <w:sz w:val="18"/>
+              </w:rPr>
+            </w:r>
+            <w:r>
+              <w:rPr>
+                <w:b/>
+                <w:sz w:val="18"/>
+              </w:rPr>
+              <w:t>Source down / logs purged</w:t>
+            </w:r>
+          </w:p>
+        </w:tc>
+        <w:tc>
+          <w:tcPr>
+            <w:tcW w:type="dxa" w:w="2880"/>
+          </w:tcPr>
+          <w:p>
+            <w:r>
+              <w:rPr>
+                <w:sz w:val="18"/>
+              </w:rPr>
+            </w:r>
+            <w:r>
+              <w:rPr>
+                <w:sz w:val="18"/>
+              </w:rPr>
+              <w:t xml:space="preserve">CDC pauses; catches up if archive logs retained (~24h) — else a </w:t>
+            </w:r>
+            <w:r>
+              <w:rPr>
+                <w:b/>
+                <w:sz w:val="18"/>
+              </w:rPr>
+              <w:t>full re-seed</w:t>
+            </w:r>
+          </w:p>
+        </w:tc>
+        <w:tc>
+          <w:tcPr>
+            <w:tcW w:type="dxa" w:w="2880"/>
+          </w:tcPr>
+          <w:p>
+            <w:r>
+              <w:rPr>
+                <w:sz w:val="18"/>
+              </w:rPr>
+            </w:r>
+            <w:r>
+              <w:rPr>
+                <w:sz w:val="18"/>
+              </w:rPr>
+              <w:t>Run fails and retries; next run resumes from the watermark (source is truth, we re-read) — no re-seed</w:t>
+            </w:r>
+          </w:p>
+        </w:tc>
+      </w:tr>
+      <w:tr>
+        <w:tc>
+          <w:tcPr>
+            <w:tcW w:type="dxa" w:w="2880"/>
+          </w:tcPr>
+          <w:p>
+            <w:r>
+              <w:rPr>
+                <w:sz w:val="18"/>
+              </w:rPr>
+            </w:r>
+            <w:r>
+              <w:rPr>
+                <w:b/>
+                <w:sz w:val="18"/>
+              </w:rPr>
+              <w:t>Bad / sensitive data</w:t>
+            </w:r>
+          </w:p>
+        </w:tc>
+        <w:tc>
+          <w:tcPr>
+            <w:tcW w:type="dxa" w:w="2880"/>
+          </w:tcPr>
+          <w:p>
+            <w:r>
+              <w:rPr>
+                <w:sz w:val="18"/>
+              </w:rPr>
+            </w:r>
+            <w:r>
+              <w:rPr>
+                <w:sz w:val="18"/>
+              </w:rPr>
+              <w:t>Replicated as-is (bad rows *and* PII land raw in OneLake)</w:t>
+            </w:r>
+          </w:p>
+        </w:tc>
+        <w:tc>
+          <w:tcPr>
+            <w:tcW w:type="dxa" w:w="2880"/>
+          </w:tcPr>
+          <w:p>
+            <w:r>
+              <w:rPr>
+                <w:sz w:val="18"/>
+              </w:rPr>
+            </w:r>
+            <w:r>
+              <w:rPr>
+                <w:sz w:val="18"/>
+              </w:rPr>
+              <w:t xml:space="preserve">DQ </w:t>
+            </w:r>
+            <w:r>
+              <w:rPr>
+                <w:b/>
+                <w:sz w:val="18"/>
+              </w:rPr>
+              <w:t>quarantines</w:t>
+            </w:r>
+            <w:r>
+              <w:rPr>
+                <w:sz w:val="18"/>
+              </w:rPr>
+              <w:t xml:space="preserve"> bad rows before gold; </w:t>
+            </w:r>
+            <w:r>
+              <w:rPr>
+                <w:rFonts w:ascii="Consolas" w:hAnsi="Consolas"/>
+                <w:color w:val="A31F34"/>
+                <w:sz w:val="18"/>
+              </w:rPr>
+              <w:t>cleanse</w:t>
+            </w:r>
+            <w:r>
+              <w:rPr>
+                <w:sz w:val="18"/>
+              </w:rPr>
+              <w:t>/</w:t>
+            </w:r>
+            <w:r>
+              <w:rPr>
+                <w:rFonts w:ascii="Consolas" w:hAnsi="Consolas"/>
+                <w:color w:val="A31F34"/>
+                <w:sz w:val="18"/>
+              </w:rPr>
+              <w:t>mask</w:t>
+            </w:r>
+            <w:r>
+              <w:rPr>
+                <w:sz w:val="18"/>
+              </w:rPr>
+              <w:t>/</w:t>
+            </w:r>
+            <w:r>
+              <w:rPr>
+                <w:rFonts w:ascii="Consolas" w:hAnsi="Consolas"/>
+                <w:color w:val="A31F34"/>
+                <w:sz w:val="18"/>
+              </w:rPr>
+              <w:t>select</w:t>
+            </w:r>
+            <w:r>
+              <w:rPr>
+                <w:sz w:val="18"/>
+              </w:rPr>
+              <w:t xml:space="preserve"> handle PII </w:t>
+            </w:r>
+            <w:r>
+              <w:rPr>
+                <w:b/>
+                <w:sz w:val="18"/>
+              </w:rPr>
+              <w:t>before it lands</w:t>
+            </w:r>
+          </w:p>
+        </w:tc>
+      </w:tr>
+      <w:tr>
+        <w:tc>
+          <w:tcPr>
+            <w:tcW w:type="dxa" w:w="2880"/>
+          </w:tcPr>
+          <w:p>
+            <w:r>
+              <w:rPr>
+                <w:sz w:val="18"/>
+              </w:rPr>
+            </w:r>
+            <w:r>
+              <w:rPr>
+                <w:b/>
+                <w:sz w:val="18"/>
+              </w:rPr>
+              <w:t>Point-in-time / audit</w:t>
+            </w:r>
+          </w:p>
+        </w:tc>
+        <w:tc>
+          <w:tcPr>
+            <w:tcW w:type="dxa" w:w="2880"/>
+          </w:tcPr>
+          <w:p>
+            <w:r>
+              <w:rPr>
+                <w:sz w:val="18"/>
+              </w:rPr>
+            </w:r>
+            <w:r>
+              <w:rPr>
+                <w:sz w:val="18"/>
+              </w:rPr>
+              <w:t>Current state only (Delta time-travel = replication versions, retention-limited)</w:t>
+            </w:r>
+          </w:p>
+        </w:tc>
+        <w:tc>
+          <w:tcPr>
+            <w:tcW w:type="dxa" w:w="2880"/>
+          </w:tcPr>
+          <w:p>
+            <w:r>
+              <w:rPr>
+                <w:sz w:val="18"/>
+              </w:rPr>
+            </w:r>
+            <w:r>
+              <w:rPr>
+                <w:sz w:val="18"/>
+              </w:rPr>
+              <w:t>Bronze append = raw extraction history; gold SCD2 = business history; audit tables = full lineage</w:t>
+            </w:r>
+          </w:p>
+        </w:tc>
+      </w:tr>
+    </w:tbl>
+    <w:p/>
+    <w:p>
+      <w:r>
+        <w:rPr>
+          <w:b/>
+        </w:rPr>
+        <w:t>Two scenarios deserve a callout:</w:t>
+      </w:r>
+    </w:p>
+    <w:p>
+      <w:pPr>
+        <w:pStyle w:val="ListBullet"/>
+        <w:ind w:left="360"/>
+      </w:pPr>
+      <w:r>
+        <w:rPr>
+          <w:b/>
+        </w:rPr>
+        <w:t>Updates &amp; history — framework wins for auditability.</w:t>
+      </w:r>
+      <w:r>
+        <w:t xml:space="preserve"> A mirror always shows *now*: if a</w:t>
+      </w:r>
+    </w:p>
+    <w:p>
+      <w:r>
+        <w:t xml:space="preserve">  member's status changes, it overwrites the old value. Only our </w:t>
+      </w:r>
+      <w:r>
+        <w:rPr>
+          <w:b/>
+        </w:rPr>
+        <w:t>SCD2 gold</w:t>
+      </w:r>
+      <w:r>
+        <w:t xml:space="preserve"> keeps the</w:t>
+      </w:r>
+    </w:p>
+    <w:p>
+      <w:r>
+        <w:t xml:space="preserve">  before-and-after with effective dates — which a pension corporation usually needs for audit.</w:t>
+      </w:r>
+    </w:p>
+    <w:p>
+      <w:pPr>
+        <w:pStyle w:val="ListBullet"/>
+        <w:ind w:left="360"/>
+      </w:pPr>
+      <w:r>
+        <w:rPr>
+          <w:b/>
+        </w:rPr>
+        <w:t>Deletes — mirroring wins out-of-the-box.</w:t>
+      </w:r>
+      <w:r>
+        <w:t xml:space="preserve"> The framework's honest weak spot: a watermark can't</w:t>
+      </w:r>
+    </w:p>
+    <w:p>
+      <w:r>
+        <w:t xml:space="preserve">  detect a physical delete, and silver's merge doesn't remove rows that vanished at source.</w:t>
+      </w:r>
+    </w:p>
+    <w:p>
+      <w:r>
+        <w:t xml:space="preserve">  Mirroring propagates deletes for free. If deletes matter (purged records), the framework needs a</w:t>
+      </w:r>
+    </w:p>
+    <w:p>
+      <w:r>
+        <w:t xml:space="preserve">  periodic </w:t>
+      </w:r>
+      <w:r>
+        <w:rPr>
+          <w:b/>
+        </w:rPr>
+        <w:t>full-snapshot overwrite</w:t>
+      </w:r>
+      <w:r>
+        <w:t xml:space="preserve"> or a </w:t>
+      </w:r>
+      <w:r>
+        <w:rPr>
+          <w:b/>
+        </w:rPr>
+        <w:t>key-reconciliation / soft-delete</w:t>
+      </w:r>
+      <w:r>
+        <w:t xml:space="preserve"> step (the pattern</w:t>
+      </w:r>
+    </w:p>
+    <w:p>
+      <w:r>
+        <w:t xml:space="preserve">  exists in the MXData accelerator's </w:t>
+      </w:r>
+      <w:r>
+        <w:rPr>
+          <w:rFonts w:ascii="Consolas" w:hAnsi="Consolas"/>
+          <w:color w:val="A31F34"/>
+        </w:rPr>
+        <w:t>_is_deleted</w:t>
+      </w:r>
+      <w:r>
+        <w:t xml:space="preserve"> handling — a natural enhancement here). Weigh it</w:t>
+      </w:r>
+    </w:p>
+    <w:p>
+      <w:r>
+        <w:t xml:space="preserve">  per table.</w:t>
+      </w:r>
+    </w:p>
+    <w:p>
+      <w:pPr>
+        <w:pStyle w:val="Heading2"/>
+      </w:pPr>
+      <w:r/>
+      <w:r>
+        <w:t>4. Pros &amp; cons</w:t>
       </w:r>
     </w:p>
     <w:p>
@@ -1897,7 +3028,7 @@
       </w:pPr>
       <w:r/>
       <w:r>
-        <w:t>4. Promotion across environments (DEV → UAT → PROD)</w:t>
+        <w:t>5. Promotion across environments (DEV → UAT → PROD)</w:t>
       </w:r>
     </w:p>
     <w:p>
@@ -2307,7 +3438,7 @@
       </w:pPr>
       <w:r/>
       <w:r>
-        <w:t>5. When to choose which</w:t>
+        <w:t>6. When to choose which</w:t>
       </w:r>
     </w:p>
     <w:p>
@@ -2428,7 +3559,7 @@
       </w:pPr>
       <w:r/>
       <w:r>
-        <w:t>6. Recommendation for BCPC</w:t>
+        <w:t>7. Recommendation for BCPC</w:t>
       </w:r>
     </w:p>
     <w:p>
@@ -2573,7 +3704,7 @@
         <w:rPr>
           <w:b/>
         </w:rPr>
-        <w:t>Simpler promotion (§4).</w:t>
+        <w:t>Simpler promotion (§5).</w:t>
       </w:r>
       <w:r>
         <w:t xml:space="preserve"> The whole medallion promotes as one config-as-code unit; mirroring</w:t>

</xml_diff>

<commit_message>
BRONZE_VS_MIRRORING: reframe deletes — append-snapshot + soft-delete gives better audit than mirror's silent removal
</commit_message>
<xml_diff>
--- a/control_plane/docs/BRONZE_VS_MIRRORING.docx
+++ b/control_plane/docs/BRONZE_VS_MIRRORING.docx
@@ -1805,13 +1805,26 @@
                 <w:b/>
                 <w:sz w:val="18"/>
               </w:rPr>
-              <w:t>removes</w:t>
+              <w:t>silently removes</w:t>
             </w:r>
             <w:r>
               <w:rPr>
                 <w:sz w:val="18"/>
               </w:rPr>
-              <w:t xml:space="preserve"> the row from the mirror — deletions propagate natively</w:t>
+              <w:t xml:space="preserve"> the row — the mirror matches the source, but the deleted record is </w:t>
+            </w:r>
+            <w:r>
+              <w:rPr>
+                <w:b/>
+                <w:sz w:val="18"/>
+              </w:rPr>
+              <w:t>gone</w:t>
+            </w:r>
+            <w:r>
+              <w:rPr>
+                <w:sz w:val="18"/>
+              </w:rPr>
+              <w:t xml:space="preserve"> from the current table (recoverable only via Delta time-travel: retention-limited, replication-versioned — awkward for audit)</w:t>
             </w:r>
           </w:p>
         </w:tc>
@@ -1830,26 +1843,26 @@
                 <w:b/>
                 <w:sz w:val="18"/>
               </w:rPr>
-              <w:t>Weak spot:</w:t>
+              <w:t>Better for audit if designed for it:</w:t>
             </w:r>
             <w:r>
               <w:rPr>
                 <w:sz w:val="18"/>
               </w:rPr>
-              <w:t xml:space="preserve"> a watermark </w:t>
+              <w:t xml:space="preserve"> an </w:t>
             </w:r>
             <w:r>
               <w:rPr>
                 <w:b/>
                 <w:sz w:val="18"/>
               </w:rPr>
-              <w:t>can't see deletes</w:t>
+              <w:t>append-snapshot</w:t>
             </w:r>
             <w:r>
               <w:rPr>
                 <w:sz w:val="18"/>
               </w:rPr>
-              <w:t xml:space="preserve"> (a delete doesn't bump a change-date) and silver's key-merge doesn't remove absent rows. Reflecting deletes needs a full-snapshot overwrite or a key-set </w:t>
+              <w:t xml:space="preserve"> bronze keeps the record visible in prior batches ("present in batch N, gone in N+1" is a plain query); a key </w:t>
             </w:r>
             <w:r>
               <w:rPr>
@@ -1862,7 +1875,48 @@
               <w:rPr>
                 <w:sz w:val="18"/>
               </w:rPr>
-              <w:t xml:space="preserve"> (soft-delete flag) — an enhancement, not out-of-the-box</w:t>
+              <w:t xml:space="preserve"> then stamps a </w:t>
+            </w:r>
+            <w:r>
+              <w:rPr>
+                <w:b/>
+                <w:sz w:val="18"/>
+              </w:rPr>
+              <w:t>soft-delete</w:t>
+            </w:r>
+            <w:r>
+              <w:rPr>
+                <w:sz w:val="18"/>
+              </w:rPr>
+              <w:t xml:space="preserve"> (</w:t>
+            </w:r>
+            <w:r>
+              <w:rPr>
+                <w:rFonts w:ascii="Consolas" w:hAnsi="Consolas"/>
+                <w:color w:val="A31F34"/>
+                <w:sz w:val="18"/>
+              </w:rPr>
+              <w:t>_is_deleted</w:t>
+            </w:r>
+            <w:r>
+              <w:rPr>
+                <w:sz w:val="18"/>
+              </w:rPr>
+              <w:t xml:space="preserve">, </w:t>
+            </w:r>
+            <w:r>
+              <w:rPr>
+                <w:rFonts w:ascii="Consolas" w:hAnsi="Consolas"/>
+                <w:color w:val="A31F34"/>
+                <w:sz w:val="18"/>
+              </w:rPr>
+              <w:t>_deleted_at</w:t>
+            </w:r>
+            <w:r>
+              <w:rPr>
+                <w:sz w:val="18"/>
+              </w:rPr>
+              <w:t>) through silver + gold. Caveat: the *default* watermark/overwrite load won't flag deletes unless you use this pattern</w:t>
             </w:r>
           </w:p>
         </w:tc>
@@ -2591,48 +2645,76 @@
         <w:rPr>
           <w:b/>
         </w:rPr>
-        <w:t>Deletes — mirroring wins out-of-the-box.</w:t>
-      </w:r>
-      <w:r>
-        <w:t xml:space="preserve"> The framework's honest weak spot: a watermark can't</w:t>
+        <w:t>Deletes — a design choice, and for *audit* the framework can be the stronger one.</w:t>
+      </w:r>
+      <w:r>
+        <w:t xml:space="preserve"> Mirroring</w:t>
       </w:r>
     </w:p>
     <w:p>
       <w:r>
-        <w:t xml:space="preserve">  detect a physical delete, and silver's merge doesn't remove rows that vanished at source.</w:t>
-      </w:r>
-    </w:p>
-    <w:p>
-      <w:r>
-        <w:t xml:space="preserve">  Mirroring propagates deletes for free. If deletes matter (purged records), the framework needs a</w:t>
-      </w:r>
-    </w:p>
-    <w:p>
-      <w:r>
-        <w:t xml:space="preserve">  periodic </w:t>
+        <w:t xml:space="preserve">  applies deletes automatically, but that cuts both ways: the record </w:t>
       </w:r>
       <w:r>
         <w:rPr>
           <w:b/>
         </w:rPr>
-        <w:t>full-snapshot overwrite</w:t>
-      </w:r>
-      <w:r>
-        <w:t xml:space="preserve"> or a </w:t>
+        <w:t>silently disappears</w:t>
+      </w:r>
+      <w:r>
+        <w:t xml:space="preserve"> from</w:t>
+      </w:r>
+    </w:p>
+    <w:p>
+      <w:r>
+        <w:t xml:space="preserve">  the current table and is recoverable only via Delta time-travel — limited retention, and those</w:t>
+      </w:r>
+    </w:p>
+    <w:p>
+      <w:r>
+        <w:t xml:space="preserve">  versions are replication commits, not business events, so you can't cleanly answer "what was</w:t>
+      </w:r>
+    </w:p>
+    <w:p>
+      <w:r>
+        <w:t xml:space="preserve">  deleted, and when." Run as </w:t>
       </w:r>
       <w:r>
         <w:rPr>
           <w:b/>
         </w:rPr>
-        <w:t>key-reconciliation / soft-delete</w:t>
-      </w:r>
-      <w:r>
-        <w:t xml:space="preserve"> step (the pattern</w:t>
+        <w:t>append-snapshot bronze</w:t>
+      </w:r>
+      <w:r>
+        <w:t>, our framework keeps every extracted</w:t>
       </w:r>
     </w:p>
     <w:p>
       <w:r>
-        <w:t xml:space="preserve">  exists in the MXData accelerator's </w:t>
+        <w:t xml:space="preserve">  version, so "present in batch N, gone in N+1" is a plain query; a </w:t>
+      </w:r>
+      <w:r>
+        <w:rPr>
+          <w:b/>
+        </w:rPr>
+        <w:t>key reconciliation</w:t>
+      </w:r>
+      <w:r>
+        <w:t xml:space="preserve"> (diff the</w:t>
+      </w:r>
+    </w:p>
+    <w:p>
+      <w:r>
+        <w:t xml:space="preserve">  latest snapshot's keys against the model) then stamps a </w:t>
+      </w:r>
+      <w:r>
+        <w:rPr>
+          <w:b/>
+        </w:rPr>
+        <w:t>soft-delete</w:t>
+      </w:r>
+      <w:r>
+        <w:t xml:space="preserve"> (</w:t>
       </w:r>
       <w:r>
         <w:rPr>
@@ -2642,12 +2724,75 @@
         <w:t>_is_deleted</w:t>
       </w:r>
       <w:r>
-        <w:t xml:space="preserve"> handling — a natural enhancement here). Weigh it</w:t>
+        <w:t xml:space="preserve"> /</w:t>
       </w:r>
     </w:p>
     <w:p>
       <w:r>
-        <w:t xml:space="preserve">  per table.</w:t>
+        <w:t xml:space="preserve">  </w:t>
+      </w:r>
+      <w:r>
+        <w:rPr>
+          <w:rFonts w:ascii="Consolas" w:hAnsi="Consolas"/>
+          <w:color w:val="A31F34"/>
+        </w:rPr>
+        <w:t>_deleted_at</w:t>
+      </w:r>
+      <w:r>
+        <w:t>) through silver and gold, giving downstream logic *explicit* delete awareness. For a</w:t>
+      </w:r>
+    </w:p>
+    <w:p>
+      <w:r>
+        <w:t xml:space="preserve">  pension corporation that must audit removals, that's arguably </w:t>
+      </w:r>
+      <w:r>
+        <w:rPr>
+          <w:b/>
+        </w:rPr>
+        <w:t>better</w:t>
+      </w:r>
+      <w:r>
+        <w:t xml:space="preserve"> than a mirror that just</w:t>
+      </w:r>
+    </w:p>
+    <w:p>
+      <w:r>
+        <w:t xml:space="preserve">  makes the row vanish. The honest caveat: this is a </w:t>
+      </w:r>
+      <w:r>
+        <w:rPr>
+          <w:b/>
+        </w:rPr>
+        <w:t>deliberate pattern</w:t>
+      </w:r>
+      <w:r>
+        <w:t xml:space="preserve"> — the default</w:t>
+      </w:r>
+    </w:p>
+    <w:p>
+      <w:r>
+        <w:t xml:space="preserve">  watermark/overwrite load won't flag deletes on its own — and full snapshots cost storage, so</w:t>
+      </w:r>
+    </w:p>
+    <w:p>
+      <w:r>
+        <w:t xml:space="preserve">  choose it per table. The MXData accelerator already ships </w:t>
+      </w:r>
+      <w:r>
+        <w:rPr>
+          <w:rFonts w:ascii="Consolas" w:hAnsi="Consolas"/>
+          <w:color w:val="A31F34"/>
+        </w:rPr>
+        <w:t>_is_deleted</w:t>
+      </w:r>
+      <w:r>
+        <w:t xml:space="preserve"> handling, so it's a port,</w:t>
+      </w:r>
+    </w:p>
+    <w:p>
+      <w:r>
+        <w:t xml:space="preserve">  not new design.</w:t>
       </w:r>
     </w:p>
     <w:p>

</xml_diff>

<commit_message>
dropbox: snapshot/soft-delete mode via __key= files — silver delete_detection reconciliation
Name a dropped file <name>__key=<col>.<ext> to opt into snapshot semantics: silver dedups on
the business key (latest wins) and flags keys that disappear between drops as _is_deleted/
_deleted_at instead of the keyless row-hash dedup. General delete_detection=soft capability in
the silver worker, surfaced through the dropbox. Verified end-to-end (10-row snapshot -> re-drop
with 1 removed + 2 updated -> 10 silver rows, removed key flagged, rest carrying latest values).
</commit_message>
<xml_diff>
--- a/control_plane/docs/BRONZE_VS_MIRRORING.docx
+++ b/control_plane/docs/BRONZE_VS_MIRRORING.docx
@@ -1843,7 +1843,7 @@
                 <w:b/>
                 <w:sz w:val="18"/>
               </w:rPr>
-              <w:t>Better for audit if designed for it:</w:t>
+              <w:t>Better for audit, and implemented:</w:t>
             </w:r>
             <w:r>
               <w:rPr>
@@ -1862,33 +1862,21 @@
               <w:rPr>
                 <w:sz w:val="18"/>
               </w:rPr>
-              <w:t xml:space="preserve"> bronze keeps the record visible in prior batches ("present in batch N, gone in N+1" is a plain query); a key </w:t>
+              <w:t xml:space="preserve"> bronze keeps the record visible in prior batches ("present in batch N, gone in N+1" is a plain query); silver's </w:t>
             </w:r>
             <w:r>
               <w:rPr>
-                <w:b/>
+                <w:rFonts w:ascii="Consolas" w:hAnsi="Consolas"/>
+                <w:color w:val="A31F34"/>
                 <w:sz w:val="18"/>
               </w:rPr>
-              <w:t>reconciliation</w:t>
+              <w:t>delete_detection="soft"</w:t>
             </w:r>
             <w:r>
               <w:rPr>
                 <w:sz w:val="18"/>
               </w:rPr>
-              <w:t xml:space="preserve"> then stamps a </w:t>
-            </w:r>
-            <w:r>
-              <w:rPr>
-                <w:b/>
-                <w:sz w:val="18"/>
-              </w:rPr>
-              <w:t>soft-delete</w:t>
-            </w:r>
-            <w:r>
-              <w:rPr>
-                <w:sz w:val="18"/>
-              </w:rPr>
-              <w:t xml:space="preserve"> (</w:t>
+              <w:t xml:space="preserve"> reconciliation stamps </w:t>
             </w:r>
             <w:r>
               <w:rPr>
@@ -1902,7 +1890,7 @@
               <w:rPr>
                 <w:sz w:val="18"/>
               </w:rPr>
-              <w:t xml:space="preserve">, </w:t>
+              <w:t xml:space="preserve"> / </w:t>
             </w:r>
             <w:r>
               <w:rPr>
@@ -1916,7 +1904,7 @@
               <w:rPr>
                 <w:sz w:val="18"/>
               </w:rPr>
-              <w:t>) through silver + gold. Caveat: the *default* watermark/overwrite load won't flag deletes unless you use this pattern</w:t>
+              <w:t xml:space="preserve"> (latest values retained; a reappearing key flips back). Caveat: it's opt-in per object — the *default* watermark/overwrite load won't flag deletes</w:t>
             </w:r>
           </w:p>
         </w:tc>
@@ -2777,7 +2765,31 @@
     </w:p>
     <w:p>
       <w:r>
-        <w:t xml:space="preserve">  choose it per table. The MXData accelerator already ships </w:t>
+        <w:t xml:space="preserve">  choose it per table. This is </w:t>
+      </w:r>
+      <w:r>
+        <w:rPr>
+          <w:b/>
+        </w:rPr>
+        <w:t>implemented</w:t>
+      </w:r>
+      <w:r>
+        <w:t xml:space="preserve">: silver's </w:t>
+      </w:r>
+      <w:r>
+        <w:rPr>
+          <w:rFonts w:ascii="Consolas" w:hAnsi="Consolas"/>
+          <w:color w:val="A31F34"/>
+        </w:rPr>
+        <w:t>delete_detection="soft"</w:t>
+      </w:r>
+      <w:r>
+        <w:t xml:space="preserve"> (ported from the</w:t>
+      </w:r>
+    </w:p>
+    <w:p>
+      <w:r>
+        <w:t xml:space="preserve">  MXData accelerator's </w:t>
       </w:r>
       <w:r>
         <w:rPr>
@@ -2787,12 +2799,52 @@
         <w:t>_is_deleted</w:t>
       </w:r>
       <w:r>
-        <w:t xml:space="preserve"> handling, so it's a port,</w:t>
+        <w:t xml:space="preserve"> handling) does the reconciliation, surfaced through the dropbox</w:t>
       </w:r>
     </w:p>
     <w:p>
       <w:r>
-        <w:t xml:space="preserve">  not new design.</w:t>
+        <w:t xml:space="preserve">  via a </w:t>
+      </w:r>
+      <w:r>
+        <w:rPr>
+          <w:rFonts w:ascii="Consolas" w:hAnsi="Consolas"/>
+          <w:color w:val="A31F34"/>
+        </w:rPr>
+        <w:t>&lt;name&gt;__key=&lt;col&gt;.&lt;ext&gt;</w:t>
+      </w:r>
+      <w:r>
+        <w:t xml:space="preserve"> filename (see </w:t>
+      </w:r>
+      <w:r>
+        <w:rPr>
+          <w:rFonts w:ascii="Consolas" w:hAnsi="Consolas"/>
+          <w:color w:val="A31F34"/>
+        </w:rPr>
+        <w:t>DESIGN.md</w:t>
+      </w:r>
+      <w:r>
+        <w:t xml:space="preserve"> §8). Verified end-to-end: a 10-row</w:t>
+      </w:r>
+    </w:p>
+    <w:p>
+      <w:r>
+        <w:t xml:space="preserve">  snapshot, then a re-drop with one row removed + two updated, yields 10 silver rows — the removed</w:t>
+      </w:r>
+    </w:p>
+    <w:p>
+      <w:r>
+        <w:t xml:space="preserve">  key flagged </w:t>
+      </w:r>
+      <w:r>
+        <w:rPr>
+          <w:rFonts w:ascii="Consolas" w:hAnsi="Consolas"/>
+          <w:color w:val="A31F34"/>
+        </w:rPr>
+        <w:t>_is_deleted</w:t>
+      </w:r>
+      <w:r>
+        <w:t xml:space="preserve"> with its last-known values, the rest carrying the latest updates.</w:t>
       </w:r>
     </w:p>
     <w:p>

</xml_diff>

<commit_message>
bronze: append-only always; silver: auto delete-detection on keyed full loads
Bronze is now a pure append-only audit log for every load (full snapshot or incremental delta),
never overwritten. Silver reduces to current state: keyed -> latest-per-key upsert; keyless ->
latest snapshot only. Delete-detection is auto-on for any keyed full/snapshot load (opt out with
source_options delete_detection='off'); excluded for incremental (a watermark delta can't reveal a
delete). merge_upsert enables Delta autoMerge so _is_deleted can be added to pre-existing silver
tables. Verified: full-load keyed object, run1 (detection off) -> 10 rows no delete cols; run2
(auto-on) -> schema evolves, 10 rows 1 flagged, bronze retains both snapshots (19 rows).
</commit_message>
<xml_diff>
--- a/control_plane/docs/BRONZE_VS_MIRRORING.docx
+++ b/control_plane/docs/BRONZE_VS_MIRRORING.docx
@@ -1843,40 +1843,39 @@
                 <w:b/>
                 <w:sz w:val="18"/>
               </w:rPr>
-              <w:t>Better for audit, and implemented:</w:t>
+              <w:t>Better for audit, and on by default:</w:t>
             </w:r>
             <w:r>
               <w:rPr>
                 <w:sz w:val="18"/>
               </w:rPr>
-              <w:t xml:space="preserve"> an </w:t>
+              <w:t xml:space="preserve"> bronze is </w:t>
             </w:r>
             <w:r>
               <w:rPr>
                 <w:b/>
                 <w:sz w:val="18"/>
               </w:rPr>
-              <w:t>append-snapshot</w:t>
+              <w:t>append-only</w:t>
             </w:r>
             <w:r>
               <w:rPr>
                 <w:sz w:val="18"/>
               </w:rPr>
-              <w:t xml:space="preserve"> bronze keeps the record visible in prior batches ("present in batch N, gone in N+1" is a plain query); silver's </w:t>
+              <w:t xml:space="preserve"> (every snapshot kept — "present in batch N, gone in N+1" is a plain query); on a </w:t>
             </w:r>
             <w:r>
               <w:rPr>
-                <w:rFonts w:ascii="Consolas" w:hAnsi="Consolas"/>
-                <w:color w:val="A31F34"/>
+                <w:b/>
                 <w:sz w:val="18"/>
               </w:rPr>
-              <w:t>delete_detection="soft"</w:t>
+              <w:t>keyed full load</w:t>
             </w:r>
             <w:r>
               <w:rPr>
                 <w:sz w:val="18"/>
               </w:rPr>
-              <w:t xml:space="preserve"> reconciliation stamps </w:t>
+              <w:t xml:space="preserve"> silver auto-stamps </w:t>
             </w:r>
             <w:r>
               <w:rPr>
@@ -1904,7 +1903,29 @@
               <w:rPr>
                 <w:sz w:val="18"/>
               </w:rPr>
-              <w:t xml:space="preserve"> (latest values retained; a reappearing key flips back). Caveat: it's opt-in per object — the *default* watermark/overwrite load won't flag deletes</w:t>
+              <w:t xml:space="preserve"> (latest values retained; a reappearing key flips back). Only exclusion: </w:t>
+            </w:r>
+            <w:r>
+              <w:rPr>
+                <w:rFonts w:ascii="Consolas" w:hAnsi="Consolas"/>
+                <w:color w:val="A31F34"/>
+                <w:sz w:val="18"/>
+              </w:rPr>
+              <w:t>incremental</w:t>
+            </w:r>
+            <w:r>
+              <w:rPr>
+                <w:sz w:val="18"/>
+              </w:rPr>
+              <w:t xml:space="preserve"> loads (a delta can't reveal a delete) — keep such a table on </w:t>
+            </w:r>
+            <w:r>
+              <w:rPr>
+                <w:rFonts w:ascii="Consolas" w:hAnsi="Consolas"/>
+                <w:color w:val="A31F34"/>
+                <w:sz w:val="18"/>
+              </w:rPr>
+              <w:t>full</w:t>
             </w:r>
           </w:p>
         </w:tc>
@@ -2771,25 +2792,29 @@
         <w:rPr>
           <w:b/>
         </w:rPr>
-        <w:t>implemented</w:t>
-      </w:r>
-      <w:r>
-        <w:t xml:space="preserve">: silver's </w:t>
-      </w:r>
-      <w:r>
-        <w:rPr>
-          <w:rFonts w:ascii="Consolas" w:hAnsi="Consolas"/>
-          <w:color w:val="A31F34"/>
-        </w:rPr>
-        <w:t>delete_detection="soft"</w:t>
-      </w:r>
-      <w:r>
-        <w:t xml:space="preserve"> (ported from the</w:t>
+        <w:t>implemented and on by default</w:t>
+      </w:r>
+      <w:r>
+        <w:t>: bronze is append-only, and any</w:t>
       </w:r>
     </w:p>
     <w:p>
       <w:r>
-        <w:t xml:space="preserve">  MXData accelerator's </w:t>
+        <w:t xml:space="preserve">  </w:t>
+      </w:r>
+      <w:r>
+        <w:rPr>
+          <w:b/>
+        </w:rPr>
+        <w:t>keyed full load</w:t>
+      </w:r>
+      <w:r>
+        <w:t xml:space="preserve"> auto-runs the reconciliation (ported from the MXData accelerator's</w:t>
+      </w:r>
+    </w:p>
+    <w:p>
+      <w:r>
+        <w:t xml:space="preserve">  </w:t>
       </w:r>
       <w:r>
         <w:rPr>
@@ -2799,42 +2824,37 @@
         <w:t>_is_deleted</w:t>
       </w:r>
       <w:r>
-        <w:t xml:space="preserve"> handling) does the reconciliation, surfaced through the dropbox</w:t>
-      </w:r>
-    </w:p>
-    <w:p>
-      <w:r>
-        <w:t xml:space="preserve">  via a </w:t>
+        <w:t xml:space="preserve"> handling) — set </w:t>
       </w:r>
       <w:r>
         <w:rPr>
           <w:rFonts w:ascii="Consolas" w:hAnsi="Consolas"/>
           <w:color w:val="A31F34"/>
         </w:rPr>
-        <w:t>&lt;name&gt;__key=&lt;col&gt;.&lt;ext&gt;</w:t>
-      </w:r>
-      <w:r>
-        <w:t xml:space="preserve"> filename (see </w:t>
+        <w:t>delete_detection="off"</w:t>
+      </w:r>
+      <w:r>
+        <w:t xml:space="preserve"> to disable, and note it can't apply to</w:t>
+      </w:r>
+    </w:p>
+    <w:p>
+      <w:r>
+        <w:t xml:space="preserve">  </w:t>
       </w:r>
       <w:r>
         <w:rPr>
           <w:rFonts w:ascii="Consolas" w:hAnsi="Consolas"/>
           <w:color w:val="A31F34"/>
         </w:rPr>
-        <w:t>DESIGN.md</w:t>
-      </w:r>
-      <w:r>
-        <w:t xml:space="preserve"> §8). Verified end-to-end: a 10-row</w:t>
+        <w:t>incremental</w:t>
+      </w:r>
+      <w:r>
+        <w:t xml:space="preserve"> loads. Verified end-to-end: a 10-row snapshot, then a reload with one row removed +</w:t>
       </w:r>
     </w:p>
     <w:p>
       <w:r>
-        <w:t xml:space="preserve">  snapshot, then a re-drop with one row removed + two updated, yields 10 silver rows — the removed</w:t>
-      </w:r>
-    </w:p>
-    <w:p>
-      <w:r>
-        <w:t xml:space="preserve">  key flagged </w:t>
+        <w:t xml:space="preserve">  two updated, yields 10 silver rows — the removed key flagged </w:t>
       </w:r>
       <w:r>
         <w:rPr>
@@ -2844,7 +2864,12 @@
         <w:t>_is_deleted</w:t>
       </w:r>
       <w:r>
-        <w:t xml:space="preserve"> with its last-known values, the rest carrying the latest updates.</w:t>
+        <w:t xml:space="preserve"> with its last-known</w:t>
+      </w:r>
+    </w:p>
+    <w:p>
+      <w:r>
+        <w:t xml:space="preserve">  values, the rest carrying the latest updates; bronze retains both snapshots (19 rows).</w:t>
       </w:r>
     </w:p>
     <w:p>

</xml_diff>

<commit_message>
BRONZE_VS_MIRRORING: add gateway consideration — mirroring needs a dedicated on-prem gateway; framework reuses existing VNet gateway
</commit_message>
<xml_diff>
--- a/control_plane/docs/BRONZE_VS_MIRRORING.docx
+++ b/control_plane/docs/BRONZE_VS_MIRRORING.docx
@@ -964,6 +964,168 @@
                 <w:b/>
                 <w:sz w:val="18"/>
               </w:rPr>
+              <w:t>Connectivity (on-prem Oracle)</w:t>
+            </w:r>
+          </w:p>
+        </w:tc>
+        <w:tc>
+          <w:tcPr>
+            <w:tcW w:type="dxa" w:w="2880"/>
+          </w:tcPr>
+          <w:p>
+            <w:r>
+              <w:rPr>
+                <w:sz w:val="18"/>
+              </w:rPr>
+            </w:r>
+            <w:r>
+              <w:rPr>
+                <w:sz w:val="18"/>
+              </w:rPr>
+              <w:t xml:space="preserve">Connects </w:t>
+            </w:r>
+            <w:r>
+              <w:rPr>
+                <w:b/>
+                <w:sz w:val="18"/>
+              </w:rPr>
+              <w:t>only via an on-premises data gateway</w:t>
+            </w:r>
+            <w:r>
+              <w:rPr>
+                <w:sz w:val="18"/>
+              </w:rPr>
+              <w:t xml:space="preserve"> — the existing </w:t>
+            </w:r>
+            <w:r>
+              <w:rPr>
+                <w:b/>
+                <w:sz w:val="18"/>
+              </w:rPr>
+              <w:t>VNet gateway (PBI) can't be reused</w:t>
+            </w:r>
+            <w:r>
+              <w:rPr>
+                <w:sz w:val="18"/>
+              </w:rPr>
+              <w:t xml:space="preserve">; stand up a </w:t>
+            </w:r>
+            <w:r>
+              <w:rPr>
+                <w:b/>
+                <w:sz w:val="18"/>
+              </w:rPr>
+              <w:t>dedicated</w:t>
+            </w:r>
+            <w:r>
+              <w:rPr>
+                <w:sz w:val="18"/>
+              </w:rPr>
+              <w:t xml:space="preserve"> gateway, HA-sized for </w:t>
+            </w:r>
+            <w:r>
+              <w:rPr>
+                <w:b/>
+                <w:sz w:val="18"/>
+              </w:rPr>
+              <w:t>continuous 24/7 CDC</w:t>
+            </w:r>
+          </w:p>
+        </w:tc>
+        <w:tc>
+          <w:tcPr>
+            <w:tcW w:type="dxa" w:w="2880"/>
+          </w:tcPr>
+          <w:p>
+            <w:r>
+              <w:rPr>
+                <w:sz w:val="18"/>
+              </w:rPr>
+            </w:r>
+            <w:r>
+              <w:rPr>
+                <w:sz w:val="18"/>
+              </w:rPr>
+              <w:t xml:space="preserve">Data-pipeline </w:t>
+            </w:r>
+            <w:r>
+              <w:rPr>
+                <w:b/>
+                <w:sz w:val="18"/>
+              </w:rPr>
+              <w:t>Copy</w:t>
+            </w:r>
+            <w:r>
+              <w:rPr>
+                <w:sz w:val="18"/>
+              </w:rPr>
+              <w:t xml:space="preserve"> connection binds to </w:t>
+            </w:r>
+            <w:r>
+              <w:rPr>
+                <w:b/>
+                <w:sz w:val="18"/>
+              </w:rPr>
+              <w:t>either</w:t>
+            </w:r>
+            <w:r>
+              <w:rPr>
+                <w:sz w:val="18"/>
+              </w:rPr>
+              <w:t xml:space="preserve"> an on-prem </w:t>
+            </w:r>
+            <w:r>
+              <w:rPr>
+                <w:b/>
+                <w:sz w:val="18"/>
+              </w:rPr>
+              <w:t>or the existing VNet gateway</w:t>
+            </w:r>
+            <w:r>
+              <w:rPr>
+                <w:sz w:val="18"/>
+              </w:rPr>
+              <w:t xml:space="preserve"> (if Oracle is reachable through that VNet) — </w:t>
+            </w:r>
+            <w:r>
+              <w:rPr>
+                <w:b/>
+                <w:sz w:val="18"/>
+              </w:rPr>
+              <w:t>reuse existing infra</w:t>
+            </w:r>
+            <w:r>
+              <w:rPr>
+                <w:sz w:val="18"/>
+              </w:rPr>
+              <w:t xml:space="preserve">; gateway is busy only during </w:t>
+            </w:r>
+            <w:r>
+              <w:rPr>
+                <w:b/>
+                <w:sz w:val="18"/>
+              </w:rPr>
+              <w:t>scheduled loads</w:t>
+            </w:r>
+          </w:p>
+        </w:tc>
+      </w:tr>
+      <w:tr>
+        <w:tc>
+          <w:tcPr>
+            <w:tcW w:type="dxa" w:w="2880"/>
+          </w:tcPr>
+          <w:p>
+            <w:r>
+              <w:rPr>
+                <w:sz w:val="18"/>
+              </w:rPr>
+            </w:r>
+            <w:r>
+              <w:rPr>
+                <w:b/>
+                <w:sz w:val="18"/>
+              </w:rPr>
               <w:t>Schema / type coverage</w:t>
             </w:r>
           </w:p>
@@ -1519,6 +1681,141 @@
       </w:tr>
     </w:tbl>
     <w:p/>
+    <w:p>
+      <w:r>
+        <w:t xml:space="preserve">&gt; </w:t>
+      </w:r>
+      <w:r>
+        <w:rPr>
+          <w:b/>
+        </w:rPr>
+        <w:t>Gateway note (BCPC-specific).</w:t>
+      </w:r>
+      <w:r>
+        <w:t xml:space="preserve"> We already run a </w:t>
+      </w:r>
+      <w:r>
+        <w:rPr>
+          <w:b/>
+        </w:rPr>
+        <w:t>VNet data gateway</w:t>
+      </w:r>
+      <w:r>
+        <w:t xml:space="preserve"> for some Power BI</w:t>
+      </w:r>
+    </w:p>
+    <w:p>
+      <w:r>
+        <w:t xml:space="preserve">&gt; reports. That gateway </w:t>
+      </w:r>
+      <w:r>
+        <w:rPr>
+          <w:b/>
+        </w:rPr>
+        <w:t>cannot serve Fabric Mirroring</w:t>
+      </w:r>
+      <w:r>
+        <w:t xml:space="preserve"> — mirroring reaches a private/on-prem</w:t>
+      </w:r>
+    </w:p>
+    <w:p>
+      <w:r>
+        <w:t xml:space="preserve">&gt; source through the </w:t>
+      </w:r>
+      <w:r>
+        <w:rPr>
+          <w:b/>
+        </w:rPr>
+        <w:t>on-premises data gateway</w:t>
+      </w:r>
+      <w:r>
+        <w:t xml:space="preserve"> only, so mirroring Oracle means provisioning a</w:t>
+      </w:r>
+    </w:p>
+    <w:p>
+      <w:r>
+        <w:t xml:space="preserve">&gt; </w:t>
+      </w:r>
+      <w:r>
+        <w:rPr>
+          <w:b/>
+        </w:rPr>
+        <w:t>new, dedicated</w:t>
+      </w:r>
+      <w:r>
+        <w:t xml:space="preserve"> gateway (installed + patched + clustered for HA, running </w:t>
+      </w:r>
+      <w:r>
+        <w:rPr>
+          <w:b/>
+        </w:rPr>
+        <w:t>continuously</w:t>
+      </w:r>
+      <w:r>
+        <w:t xml:space="preserve"> for</w:t>
+      </w:r>
+    </w:p>
+    <w:p>
+      <w:r>
+        <w:t xml:space="preserve">&gt; always-on CDC). Our framework's on-prem path is a Data-pipeline </w:t>
+      </w:r>
+      <w:r>
+        <w:rPr>
+          <w:b/>
+        </w:rPr>
+        <w:t>Copy</w:t>
+      </w:r>
+      <w:r>
+        <w:t>, whose connection can run</w:t>
+      </w:r>
+    </w:p>
+    <w:p>
+      <w:r>
+        <w:t xml:space="preserve">&gt; through </w:t>
+      </w:r>
+      <w:r>
+        <w:rPr>
+          <w:b/>
+        </w:rPr>
+        <w:t>either</w:t>
+      </w:r>
+      <w:r>
+        <w:t xml:space="preserve"> an on-prem gateway </w:t>
+      </w:r>
+      <w:r>
+        <w:rPr>
+          <w:b/>
+        </w:rPr>
+        <w:t>or the existing VNet gateway</w:t>
+      </w:r>
+      <w:r>
+        <w:t xml:space="preserve"> (assuming the Oracle host is</w:t>
+      </w:r>
+    </w:p>
+    <w:p>
+      <w:r>
+        <w:t xml:space="preserve">&gt; reachable through that VNet) — so it can </w:t>
+      </w:r>
+      <w:r>
+        <w:rPr>
+          <w:b/>
+        </w:rPr>
+        <w:t>reuse infrastructure we already operate</w:t>
+      </w:r>
+      <w:r>
+        <w:t>, and only</w:t>
+      </w:r>
+    </w:p>
+    <w:p>
+      <w:r>
+        <w:t>&gt; during scheduled load windows. *(Fabric gateway support for mirroring is still evolving — confirm</w:t>
+      </w:r>
+    </w:p>
+    <w:p>
+      <w:r>
+        <w:t>&gt; against current docs for the Oracle connector and our exact network topology before sizing.)*</w:t>
+      </w:r>
+    </w:p>
     <w:p>
       <w:pPr>
         <w:pStyle w:val="Heading2"/>
@@ -3052,6 +3349,26 @@
         <w:ind w:left="360"/>
       </w:pPr>
       <w:r>
+        <w:rPr>
+          <w:b/>
+        </w:rPr>
+        <w:t>New dedicated gateway</w:t>
+      </w:r>
+      <w:r>
+        <w:t xml:space="preserve"> — mirroring uses the on-premises data gateway only; our existing **VNet</w:t>
+      </w:r>
+    </w:p>
+    <w:p>
+      <w:r>
+        <w:t xml:space="preserve">  gateway can't be reused**, so it's fresh infra to stand up, patch, and HA-cluster for 24/7 CDC.</w:t>
+      </w:r>
+    </w:p>
+    <w:p>
+      <w:pPr>
+        <w:pStyle w:val="ListBullet"/>
+        <w:ind w:left="360"/>
+      </w:pPr>
+      <w:r>
         <w:t>Ops caveats: dedicated gateway VM, archive-log retention (~24h), memory spikes on large reseeds.</w:t>
       </w:r>
     </w:p>
@@ -3151,15 +3468,21 @@
         <w:rPr>
           <w:b/>
         </w:rPr>
-        <w:t>Universal</w:t>
-      </w:r>
-      <w:r>
-        <w:t xml:space="preserve"> — the same registry ingests Oracle, SQL Server, APIs, files (dropbox), and</w:t>
+        <w:t>Reuses existing connectivity</w:t>
+      </w:r>
+      <w:r>
+        <w:t xml:space="preserve"> — the on-prem Copy can run through our current </w:t>
+      </w:r>
+      <w:r>
+        <w:rPr>
+          <w:b/>
+        </w:rPr>
+        <w:t>VNet gateway</w:t>
       </w:r>
     </w:p>
     <w:p>
       <w:r>
-        <w:t xml:space="preserve">  gateway-staged on-prem, so one pattern covers the whole estate, not just mirror-eligible DBs.</w:t>
+        <w:t xml:space="preserve">  (no new dedicated gateway to provision/HA), and only during scheduled loads, not 24/7.</w:t>
       </w:r>
     </w:p>
     <w:p>
@@ -3171,10 +3494,15 @@
         <w:rPr>
           <w:b/>
         </w:rPr>
-        <w:t>Config-as-code + promotion</w:t>
-      </w:r>
-      <w:r>
-        <w:t xml:space="preserve"> — declared once, promoted across environments, lineage in config.</w:t>
+        <w:t>Universal</w:t>
+      </w:r>
+      <w:r>
+        <w:t xml:space="preserve"> — the same registry ingests Oracle, SQL Server, APIs, files (dropbox), and</w:t>
+      </w:r>
+    </w:p>
+    <w:p>
+      <w:r>
+        <w:t xml:space="preserve">  gateway-staged on-prem, so one pattern covers the whole estate, not just mirror-eligible DBs.</w:t>
       </w:r>
     </w:p>
     <w:p>
@@ -3186,18 +3514,10 @@
         <w:rPr>
           <w:b/>
         </w:rPr>
-        <w:t>Full modelling control</w:t>
-      </w:r>
-      <w:r>
-        <w:t xml:space="preserve"> — typing, SCD history, the gold star, all owned by us.</w:t>
-      </w:r>
-    </w:p>
-    <w:p>
-      <w:r>
-        <w:rPr>
-          <w:b/>
-        </w:rPr>
-        <w:t>Cons</w:t>
+        <w:t>Config-as-code + promotion</w:t>
+      </w:r>
+      <w:r>
+        <w:t xml:space="preserve"> — declared once, promoted across environments, lineage in config.</w:t>
       </w:r>
     </w:p>
     <w:p>
@@ -3209,10 +3529,18 @@
         <w:rPr>
           <w:b/>
         </w:rPr>
-        <w:t>Batch, not real-time</w:t>
-      </w:r>
-      <w:r>
-        <w:t xml:space="preserve"> — freshness is the scheduled/triggered cadence, not seconds.</w:t>
+        <w:t>Full modelling control</w:t>
+      </w:r>
+      <w:r>
+        <w:t xml:space="preserve"> — typing, SCD history, the gold star, all owned by us.</w:t>
+      </w:r>
+    </w:p>
+    <w:p>
+      <w:r>
+        <w:rPr>
+          <w:b/>
+        </w:rPr>
+        <w:t>Cons</w:t>
       </w:r>
     </w:p>
     <w:p>
@@ -3224,10 +3552,10 @@
         <w:rPr>
           <w:b/>
         </w:rPr>
-        <w:t>We own the pipeline</w:t>
-      </w:r>
-      <w:r>
-        <w:t xml:space="preserve"> — retries, capacity tuning, and DQ authoring are our responsibility.</w:t>
+        <w:t>Batch, not real-time</w:t>
+      </w:r>
+      <w:r>
+        <w:t xml:space="preserve"> — freshness is the scheduled/triggered cadence, not seconds.</w:t>
       </w:r>
     </w:p>
     <w:p>
@@ -3236,6 +3564,21 @@
         <w:ind w:left="360"/>
       </w:pPr>
       <w:r>
+        <w:rPr>
+          <w:b/>
+        </w:rPr>
+        <w:t>We own the pipeline</w:t>
+      </w:r>
+      <w:r>
+        <w:t xml:space="preserve"> — retries, capacity tuning, and DQ authoring are our responsibility.</w:t>
+      </w:r>
+    </w:p>
+    <w:p>
+      <w:pPr>
+        <w:pStyle w:val="ListBullet"/>
+        <w:ind w:left="360"/>
+      </w:pPr>
+      <w:r>
         <w:t>Incremental extraction needs a watermark column (or a full reload) — CDC-grade change capture is</w:t>
       </w:r>
     </w:p>
@@ -3940,6 +4283,48 @@
     <w:p>
       <w:r>
         <w:t xml:space="preserve">   start, and re-seed as a checklist repeated in each workspace.</w:t>
+      </w:r>
+    </w:p>
+    <w:p>
+      <w:r>
+        <w:t xml:space="preserve">7. </w:t>
+      </w:r>
+      <w:r>
+        <w:rPr>
+          <w:b/>
+        </w:rPr>
+        <w:t>No new gateway.</w:t>
+      </w:r>
+      <w:r>
+        <w:t xml:space="preserve"> The framework's on-prem Copy can reuse our </w:t>
+      </w:r>
+      <w:r>
+        <w:rPr>
+          <w:b/>
+        </w:rPr>
+        <w:t>existing VNet gateway</w:t>
+      </w:r>
+      <w:r>
+        <w:t>;</w:t>
+      </w:r>
+    </w:p>
+    <w:p>
+      <w:r>
+        <w:t xml:space="preserve">   mirroring requires a </w:t>
+      </w:r>
+      <w:r>
+        <w:rPr>
+          <w:b/>
+        </w:rPr>
+        <w:t>dedicated on-premises data gateway</w:t>
+      </w:r>
+      <w:r>
+        <w:t xml:space="preserve"> (the VNet one can't serve it), running</w:t>
+      </w:r>
+    </w:p>
+    <w:p>
+      <w:r>
+        <w:t xml:space="preserve">   24/7 for CDC — extra infrastructure to provision, secure, and HA-cluster (§2).</w:t>
       </w:r>
     </w:p>
     <w:p>

</xml_diff>

<commit_message>
BRONZE_VS_MIRRORING: Oracle mirroring is GA (2026), not Preview
Microsoft Learn dropped the Preview label (May 2026 refresh; OCI + Oracle Database@Azure now
listed as supported). Update the maturity row, remove the Preview con, reframe recommendation
factor 4 (maturity is no longer the differentiator), and update the mirroring diagram.
</commit_message>
<xml_diff>
--- a/control_plane/docs/BRONZE_VS_MIRRORING.docx
+++ b/control_plane/docs/BRONZE_VS_MIRRORING.docx
@@ -127,16 +127,16 @@
     </w:p>
     <w:p>
       <w:r>
-        <w:t xml:space="preserve">&gt; the mirror into our existing silver/gold. Mirroring for Oracle is still </w:t>
+        <w:t xml:space="preserve">&gt; the mirror into our existing silver/gold. Mirroring for Oracle is now </w:t>
       </w:r>
       <w:r>
         <w:rPr>
           <w:b/>
         </w:rPr>
-        <w:t>Preview</w:t>
-      </w:r>
-      <w:r>
-        <w:t>.</w:t>
+        <w:t>GA</w:t>
+      </w:r>
+      <w:r>
+        <w:t xml:space="preserve"> (2026).</w:t>
       </w:r>
     </w:p>
     <w:p>
@@ -1599,7 +1599,13 @@
                 <w:b/>
                 <w:sz w:val="18"/>
               </w:rPr>
-              <w:t>Preview</w:t>
+              <w:t>GA</w:t>
+            </w:r>
+            <w:r>
+              <w:rPr>
+                <w:sz w:val="18"/>
+              </w:rPr>
+              <w:t xml:space="preserve"> (2026); OCI + Oracle Database@Azure supported</w:t>
             </w:r>
           </w:p>
         </w:tc>
@@ -3316,13 +3322,16 @@
         <w:ind w:left="360"/>
       </w:pPr>
       <w:r>
+        <w:t xml:space="preserve">You still build </w:t>
+      </w:r>
+      <w:r>
         <w:rPr>
           <w:b/>
         </w:rPr>
-        <w:t>Still Preview</w:t>
-      </w:r>
-      <w:r>
-        <w:t xml:space="preserve"> for Oracle — not yet a fit for a production system of record.</w:t>
+        <w:t>silver/gold</w:t>
+      </w:r>
+      <w:r>
+        <w:t xml:space="preserve"> — mirroring is not a substitute for the modelling layer.</w:t>
       </w:r>
     </w:p>
     <w:p>
@@ -3331,16 +3340,18 @@
         <w:ind w:left="360"/>
       </w:pPr>
       <w:r>
-        <w:t xml:space="preserve">You still build </w:t>
-      </w:r>
-      <w:r>
         <w:rPr>
           <w:b/>
         </w:rPr>
-        <w:t>silver/gold</w:t>
-      </w:r>
-      <w:r>
-        <w:t xml:space="preserve"> — mirroring is not a substitute for the modelling layer.</w:t>
+        <w:t>New dedicated gateway</w:t>
+      </w:r>
+      <w:r>
+        <w:t xml:space="preserve"> — mirroring uses the on-premises data gateway only; our existing **VNet</w:t>
+      </w:r>
+    </w:p>
+    <w:p>
+      <w:r>
+        <w:t xml:space="preserve">  gateway can't be reused**, so it's fresh infra to stand up, patch, and HA-cluster for 24/7 CDC.</w:t>
       </w:r>
     </w:p>
     <w:p>
@@ -3349,18 +3360,24 @@
         <w:ind w:left="360"/>
       </w:pPr>
       <w:r>
+        <w:t>Ops caveats: dedicated gateway VM, archive-log retention (~24h), memory spikes on large reseeds.</w:t>
+      </w:r>
+    </w:p>
+    <w:p>
+      <w:pPr>
+        <w:pStyle w:val="Heading3"/>
+      </w:pPr>
+      <w:r/>
+      <w:r>
+        <w:t>Our framework</w:t>
+      </w:r>
+    </w:p>
+    <w:p>
+      <w:r>
         <w:rPr>
           <w:b/>
         </w:rPr>
-        <w:t>New dedicated gateway</w:t>
-      </w:r>
-      <w:r>
-        <w:t xml:space="preserve"> — mirroring uses the on-premises data gateway only; our existing **VNet</w:t>
-      </w:r>
-    </w:p>
-    <w:p>
-      <w:r>
-        <w:t xml:space="preserve">  gateway can't be reused**, so it's fresh infra to stand up, patch, and HA-cluster for 24/7 CDC.</w:t>
+        <w:t>Pros</w:t>
       </w:r>
     </w:p>
     <w:p>
@@ -3369,24 +3386,43 @@
         <w:ind w:left="360"/>
       </w:pPr>
       <w:r>
-        <w:t>Ops caveats: dedicated gateway VM, archive-log retention (~24h), memory spikes on large reseeds.</w:t>
-      </w:r>
-    </w:p>
-    <w:p>
-      <w:pPr>
-        <w:pStyle w:val="Heading3"/>
-      </w:pPr>
-      <w:r/>
-      <w:r>
-        <w:t>Our framework</w:t>
-      </w:r>
-    </w:p>
-    <w:p>
-      <w:r>
         <w:rPr>
           <w:b/>
         </w:rPr>
-        <w:t>Pros</w:t>
+        <w:t>Governance-first</w:t>
+      </w:r>
+      <w:r>
+        <w:t xml:space="preserve"> — subset (</w:t>
+      </w:r>
+      <w:r>
+        <w:rPr>
+          <w:rFonts w:ascii="Consolas" w:hAnsi="Consolas"/>
+          <w:color w:val="A31F34"/>
+        </w:rPr>
+        <w:t>filters</w:t>
+      </w:r>
+      <w:r>
+        <w:t>/</w:t>
+      </w:r>
+      <w:r>
+        <w:rPr>
+          <w:rFonts w:ascii="Consolas" w:hAnsi="Consolas"/>
+          <w:color w:val="A31F34"/>
+        </w:rPr>
+        <w:t>select</w:t>
+      </w:r>
+      <w:r>
+        <w:t>), **mask or drop sensitive columns before they</w:t>
+      </w:r>
+    </w:p>
+    <w:p>
+      <w:r>
+        <w:t xml:space="preserve">  land**, DQ + quarantine, schema-drift detection, and code-driven security (CLS/RLS/DDM). For a</w:t>
+      </w:r>
+    </w:p>
+    <w:p>
+      <w:r>
+        <w:t xml:space="preserve">  pension org handling PII, keeping sensitive data out of raw OneLake is a material advantage.</w:t>
       </w:r>
     </w:p>
     <w:p>
@@ -3398,40 +3434,20 @@
         <w:rPr>
           <w:b/>
         </w:rPr>
-        <w:t>Governance-first</w:t>
-      </w:r>
-      <w:r>
-        <w:t xml:space="preserve"> — subset (</w:t>
+        <w:t>No source changes</w:t>
+      </w:r>
+      <w:r>
+        <w:t xml:space="preserve"> — only a </w:t>
       </w:r>
       <w:r>
         <w:rPr>
           <w:rFonts w:ascii="Consolas" w:hAnsi="Consolas"/>
           <w:color w:val="A31F34"/>
         </w:rPr>
-        <w:t>filters</w:t>
-      </w:r>
-      <w:r>
-        <w:t>/</w:t>
-      </w:r>
-      <w:r>
-        <w:rPr>
-          <w:rFonts w:ascii="Consolas" w:hAnsi="Consolas"/>
-          <w:color w:val="A31F34"/>
-        </w:rPr>
-        <w:t>select</w:t>
-      </w:r>
-      <w:r>
-        <w:t>), **mask or drop sensitive columns before they</w:t>
-      </w:r>
-    </w:p>
-    <w:p>
-      <w:r>
-        <w:t xml:space="preserve">  land**, DQ + quarantine, schema-drift detection, and code-driven security (CLS/RLS/DDM). For a</w:t>
-      </w:r>
-    </w:p>
-    <w:p>
-      <w:r>
-        <w:t xml:space="preserve">  pension org handling PII, keeping sensitive data out of raw OneLake is a material advantage.</w:t>
+        <w:t>SELECT</w:t>
+      </w:r>
+      <w:r>
+        <w:t xml:space="preserve"> account; nothing to enable on the Oracle side.</w:t>
       </w:r>
     </w:p>
     <w:p>
@@ -3443,20 +3459,21 @@
         <w:rPr>
           <w:b/>
         </w:rPr>
-        <w:t>No source changes</w:t>
-      </w:r>
-      <w:r>
-        <w:t xml:space="preserve"> — only a </w:t>
+        <w:t>Reuses existing connectivity</w:t>
+      </w:r>
+      <w:r>
+        <w:t xml:space="preserve"> — the on-prem Copy can run through our current </w:t>
       </w:r>
       <w:r>
         <w:rPr>
-          <w:rFonts w:ascii="Consolas" w:hAnsi="Consolas"/>
-          <w:color w:val="A31F34"/>
+          <w:b/>
         </w:rPr>
-        <w:t>SELECT</w:t>
-      </w:r>
-      <w:r>
-        <w:t xml:space="preserve"> account; nothing to enable on the Oracle side.</w:t>
+        <w:t>VNet gateway</w:t>
+      </w:r>
+    </w:p>
+    <w:p>
+      <w:r>
+        <w:t xml:space="preserve">  (no new dedicated gateway to provision/HA), and only during scheduled loads, not 24/7.</w:t>
       </w:r>
     </w:p>
     <w:p>
@@ -3468,21 +3485,15 @@
         <w:rPr>
           <w:b/>
         </w:rPr>
-        <w:t>Reuses existing connectivity</w:t>
-      </w:r>
-      <w:r>
-        <w:t xml:space="preserve"> — the on-prem Copy can run through our current </w:t>
-      </w:r>
-      <w:r>
-        <w:rPr>
-          <w:b/>
-        </w:rPr>
-        <w:t>VNet gateway</w:t>
+        <w:t>Universal</w:t>
+      </w:r>
+      <w:r>
+        <w:t xml:space="preserve"> — the same registry ingests Oracle, SQL Server, APIs, files (dropbox), and</w:t>
       </w:r>
     </w:p>
     <w:p>
       <w:r>
-        <w:t xml:space="preserve">  (no new dedicated gateway to provision/HA), and only during scheduled loads, not 24/7.</w:t>
+        <w:t xml:space="preserve">  gateway-staged on-prem, so one pattern covers the whole estate, not just mirror-eligible DBs.</w:t>
       </w:r>
     </w:p>
     <w:p>
@@ -3494,15 +3505,10 @@
         <w:rPr>
           <w:b/>
         </w:rPr>
-        <w:t>Universal</w:t>
-      </w:r>
-      <w:r>
-        <w:t xml:space="preserve"> — the same registry ingests Oracle, SQL Server, APIs, files (dropbox), and</w:t>
-      </w:r>
-    </w:p>
-    <w:p>
-      <w:r>
-        <w:t xml:space="preserve">  gateway-staged on-prem, so one pattern covers the whole estate, not just mirror-eligible DBs.</w:t>
+        <w:t>Config-as-code + promotion</w:t>
+      </w:r>
+      <w:r>
+        <w:t xml:space="preserve"> — declared once, promoted across environments, lineage in config.</w:t>
       </w:r>
     </w:p>
     <w:p>
@@ -3514,10 +3520,18 @@
         <w:rPr>
           <w:b/>
         </w:rPr>
-        <w:t>Config-as-code + promotion</w:t>
-      </w:r>
-      <w:r>
-        <w:t xml:space="preserve"> — declared once, promoted across environments, lineage in config.</w:t>
+        <w:t>Full modelling control</w:t>
+      </w:r>
+      <w:r>
+        <w:t xml:space="preserve"> — typing, SCD history, the gold star, all owned by us.</w:t>
+      </w:r>
+    </w:p>
+    <w:p>
+      <w:r>
+        <w:rPr>
+          <w:b/>
+        </w:rPr>
+        <w:t>Cons</w:t>
       </w:r>
     </w:p>
     <w:p>
@@ -3529,18 +3543,10 @@
         <w:rPr>
           <w:b/>
         </w:rPr>
-        <w:t>Full modelling control</w:t>
-      </w:r>
-      <w:r>
-        <w:t xml:space="preserve"> — typing, SCD history, the gold star, all owned by us.</w:t>
-      </w:r>
-    </w:p>
-    <w:p>
-      <w:r>
-        <w:rPr>
-          <w:b/>
-        </w:rPr>
-        <w:t>Cons</w:t>
+        <w:t>Batch, not real-time</w:t>
+      </w:r>
+      <w:r>
+        <w:t xml:space="preserve"> — freshness is the scheduled/triggered cadence, not seconds.</w:t>
       </w:r>
     </w:p>
     <w:p>
@@ -3552,10 +3558,10 @@
         <w:rPr>
           <w:b/>
         </w:rPr>
-        <w:t>Batch, not real-time</w:t>
-      </w:r>
-      <w:r>
-        <w:t xml:space="preserve"> — freshness is the scheduled/triggered cadence, not seconds.</w:t>
+        <w:t>We own the pipeline</w:t>
+      </w:r>
+      <w:r>
+        <w:t xml:space="preserve"> — retries, capacity tuning, and DQ authoring are our responsibility.</w:t>
       </w:r>
     </w:p>
     <w:p>
@@ -3564,13 +3570,188 @@
         <w:ind w:left="360"/>
       </w:pPr>
       <w:r>
+        <w:t>Incremental extraction needs a watermark column (or a full reload) — CDC-grade change capture is</w:t>
+      </w:r>
+    </w:p>
+    <w:p>
+      <w:r>
+        <w:t xml:space="preserve">  not automatic the way LogMiner is.</w:t>
+      </w:r>
+    </w:p>
+    <w:p>
+      <w:pPr>
+        <w:pStyle w:val="Heading2"/>
+      </w:pPr>
+      <w:r/>
+      <w:r>
+        <w:t>5. Promotion across environments (DEV → UAT → PROD)</w:t>
+      </w:r>
+    </w:p>
+    <w:p>
+      <w:r>
+        <w:t>This is where the two diverge most for a governed shop — the user explicitly asked, so it's worth</w:t>
+      </w:r>
+    </w:p>
+    <w:p>
+      <w:r>
+        <w:t>its own section.</w:t>
+      </w:r>
+    </w:p>
+    <w:p>
+      <w:r>
         <w:rPr>
           <w:b/>
         </w:rPr>
-        <w:t>We own the pipeline</w:t>
-      </w:r>
-      <w:r>
-        <w:t xml:space="preserve"> — retries, capacity tuning, and DQ authoring are our responsibility.</w:t>
+        <w:t>Our framework — one config-as-code unit.</w:t>
+      </w:r>
+      <w:r>
+        <w:t xml:space="preserve"> The *entire* medallion — sources, subset/</w:t>
+      </w:r>
+      <w:r>
+        <w:rPr>
+          <w:rFonts w:ascii="Consolas" w:hAnsi="Consolas"/>
+          <w:color w:val="A31F34"/>
+        </w:rPr>
+        <w:t>select</w:t>
+      </w:r>
+    </w:p>
+    <w:p>
+      <w:r>
+        <w:t xml:space="preserve">rules, </w:t>
+      </w:r>
+      <w:r>
+        <w:rPr>
+          <w:rFonts w:ascii="Consolas" w:hAnsi="Consolas"/>
+          <w:color w:val="A31F34"/>
+        </w:rPr>
+        <w:t>cleanse_rule</w:t>
+      </w:r>
+      <w:r>
+        <w:t xml:space="preserve">, </w:t>
+      </w:r>
+      <w:r>
+        <w:rPr>
+          <w:rFonts w:ascii="Consolas" w:hAnsi="Consolas"/>
+          <w:color w:val="A31F34"/>
+        </w:rPr>
+        <w:t>dq_rule</w:t>
+      </w:r>
+      <w:r>
+        <w:t xml:space="preserve">, the gold </w:t>
+      </w:r>
+      <w:r>
+        <w:rPr>
+          <w:rFonts w:ascii="Consolas" w:hAnsi="Consolas"/>
+          <w:color w:val="A31F34"/>
+        </w:rPr>
+        <w:t>model</w:t>
+      </w:r>
+      <w:r>
+        <w:t>/</w:t>
+      </w:r>
+      <w:r>
+        <w:rPr>
+          <w:rFonts w:ascii="Consolas" w:hAnsi="Consolas"/>
+          <w:color w:val="A31F34"/>
+        </w:rPr>
+        <w:t>gold_object</w:t>
+      </w:r>
+      <w:r>
+        <w:t xml:space="preserve">, and </w:t>
+      </w:r>
+      <w:r>
+        <w:rPr>
+          <w:rFonts w:ascii="Consolas" w:hAnsi="Consolas"/>
+          <w:color w:val="A31F34"/>
+        </w:rPr>
+        <w:t>security_policy</w:t>
+      </w:r>
+      <w:r>
+        <w:t xml:space="preserve"> — lives in</w:t>
+      </w:r>
+    </w:p>
+    <w:p>
+      <w:r>
+        <w:rPr>
+          <w:rFonts w:ascii="Consolas" w:hAnsi="Consolas"/>
+          <w:color w:val="A31F34"/>
+        </w:rPr>
+        <w:t>config_db</w:t>
+      </w:r>
+      <w:r>
+        <w:t xml:space="preserve"> and promotes as YAML (</w:t>
+      </w:r>
+      <w:r>
+        <w:rPr>
+          <w:rFonts w:ascii="Consolas" w:hAnsi="Consolas"/>
+          <w:color w:val="A31F34"/>
+        </w:rPr>
+        <w:t>cp_config</w:t>
+      </w:r>
+      <w:r>
+        <w:t>) alongside the bundled engine, which deploys</w:t>
+      </w:r>
+    </w:p>
+    <w:p>
+      <w:r>
+        <w:rPr>
+          <w:b/>
+        </w:rPr>
+        <w:t>identically</w:t>
+      </w:r>
+      <w:r>
+        <w:t xml:space="preserve"> to every environment. Connections resolve from a Key Vault </w:t>
+      </w:r>
+      <w:r>
+        <w:rPr>
+          <w:rFonts w:ascii="Consolas" w:hAnsi="Consolas"/>
+          <w:color w:val="A31F34"/>
+        </w:rPr>
+        <w:t>secret_name</w:t>
+      </w:r>
+      <w:r>
+        <w:t xml:space="preserve"> (one secret</w:t>
+      </w:r>
+    </w:p>
+    <w:p>
+      <w:r>
+        <w:t>per env), so pointing DEV / UAT / PROD at their own Oracle is a per-env *secret*, not a code change.</w:t>
+      </w:r>
+    </w:p>
+    <w:p>
+      <w:r>
+        <w:t xml:space="preserve">Promotion is </w:t>
+      </w:r>
+      <w:r>
+        <w:rPr>
+          <w:rFonts w:ascii="Consolas" w:hAnsi="Consolas"/>
+          <w:color w:val="A31F34"/>
+        </w:rPr>
+        <w:t>git → cp_bootstrap/cp_config</w:t>
+      </w:r>
+      <w:r>
+        <w:t xml:space="preserve"> per environment: **ingestion, transformation, DQ, gold,</w:t>
+      </w:r>
+    </w:p>
+    <w:p>
+      <w:r>
+        <w:t>and security move together**, versioned and diffable, with no portal clicks.</w:t>
+      </w:r>
+    </w:p>
+    <w:p>
+      <w:r>
+        <w:rPr>
+          <w:b/>
+        </w:rPr>
+        <w:t>Mirroring — the replica config promotes; the rest is per-env manual.</w:t>
+      </w:r>
+      <w:r>
+        <w:t xml:space="preserve"> Mirrored databases *do*</w:t>
+      </w:r>
+    </w:p>
+    <w:p>
+      <w:r>
+        <w:t>support Git integration and deployment pipelines now — but with real seams that add up per stage:</w:t>
       </w:r>
     </w:p>
     <w:p>
@@ -3579,12 +3760,232 @@
         <w:ind w:left="360"/>
       </w:pPr>
       <w:r>
-        <w:t>Incremental extraction needs a watermark column (or a full reload) — CDC-grade change capture is</w:t>
+        <w:rPr>
+          <w:b/>
+        </w:rPr>
+        <w:t>Only the mirror item is tracked in Git</w:t>
+      </w:r>
+      <w:r>
+        <w:t xml:space="preserve"> (</w:t>
+      </w:r>
+      <w:r>
+        <w:rPr>
+          <w:rFonts w:ascii="Consolas" w:hAnsi="Consolas"/>
+          <w:color w:val="A31F34"/>
+        </w:rPr>
+        <w:t>mirroring.json</w:t>
+      </w:r>
+      <w:r>
+        <w:t xml:space="preserve"> = the table selection). The</w:t>
       </w:r>
     </w:p>
     <w:p>
       <w:r>
-        <w:t xml:space="preserve">  not automatic the way LogMiner is.</w:t>
+        <w:t xml:space="preserve">  </w:t>
+      </w:r>
+      <w:r>
+        <w:rPr>
+          <w:b/>
+        </w:rPr>
+        <w:t>connection, credentials, gateway, SQL analytics endpoint, and any views are *not* tracked</w:t>
+      </w:r>
+      <w:r>
+        <w:t>.</w:t>
+      </w:r>
+    </w:p>
+    <w:p>
+      <w:pPr>
+        <w:pStyle w:val="ListBullet"/>
+        <w:ind w:left="360"/>
+      </w:pPr>
+      <w:r>
+        <w:t xml:space="preserve">Deploying to a stage needs a </w:t>
+      </w:r>
+      <w:r>
+        <w:rPr>
+          <w:b/>
+        </w:rPr>
+        <w:t>deployment rule</w:t>
+      </w:r>
+      <w:r>
+        <w:t xml:space="preserve"> to rebind the mirror to *that* environment's</w:t>
+      </w:r>
+    </w:p>
+    <w:p>
+      <w:r>
+        <w:t xml:space="preserve">  </w:t>
+      </w:r>
+      <w:r>
+        <w:rPr>
+          <w:b/>
+        </w:rPr>
+        <w:t>source connection ID</w:t>
+      </w:r>
+      <w:r>
+        <w:t xml:space="preserve"> — so you first create the env's gateway connection, then wire the rule.</w:t>
+      </w:r>
+    </w:p>
+    <w:p>
+      <w:pPr>
+        <w:pStyle w:val="ListBullet"/>
+        <w:ind w:left="360"/>
+      </w:pPr>
+      <w:r>
+        <w:t xml:space="preserve">The mirror </w:t>
+      </w:r>
+      <w:r>
+        <w:rPr>
+          <w:b/>
+        </w:rPr>
+        <w:t>isn't started after deployment</w:t>
+      </w:r>
+      <w:r>
+        <w:t xml:space="preserve"> — you start it manually (or via API) in each env,</w:t>
+      </w:r>
+    </w:p>
+    <w:p>
+      <w:r>
+        <w:t xml:space="preserve">  which triggers a </w:t>
+      </w:r>
+      <w:r>
+        <w:rPr>
+          <w:b/>
+        </w:rPr>
+        <w:t>full re-seed</w:t>
+      </w:r>
+      <w:r>
+        <w:t xml:space="preserve"> (fresh initial copy) from that environment's source.</w:t>
+      </w:r>
+    </w:p>
+    <w:p>
+      <w:pPr>
+        <w:pStyle w:val="ListBullet"/>
+        <w:ind w:left="360"/>
+      </w:pPr>
+      <w:r>
+        <w:t xml:space="preserve">The </w:t>
+      </w:r>
+      <w:r>
+        <w:rPr>
+          <w:b/>
+        </w:rPr>
+        <w:t>source-side CDC prerequisites</w:t>
+      </w:r>
+      <w:r>
+        <w:t xml:space="preserve"> (ARCHIVELOG, LogMiner, supplemental logging, grants) must be</w:t>
+      </w:r>
+    </w:p>
+    <w:p>
+      <w:r>
+        <w:t xml:space="preserve">  enabled by the DBA on </w:t>
+      </w:r>
+      <w:r>
+        <w:rPr>
+          <w:b/>
+        </w:rPr>
+        <w:t>each</w:t>
+      </w:r>
+      <w:r>
+        <w:t xml:space="preserve"> environment's Oracle — that isn't deployable at all.</w:t>
+      </w:r>
+    </w:p>
+    <w:p>
+      <w:pPr>
+        <w:pStyle w:val="ListBullet"/>
+        <w:ind w:left="360"/>
+      </w:pPr>
+      <w:r>
+        <w:rPr>
+          <w:b/>
+        </w:rPr>
+        <w:t>Downstream objects aren't promoted with the mirror</w:t>
+      </w:r>
+      <w:r>
+        <w:t xml:space="preserve"> — SQL-endpoint views (and of course your</w:t>
+      </w:r>
+    </w:p>
+    <w:p>
+      <w:r>
+        <w:t xml:space="preserve">  silver/gold and security) are a separate ALM track.</w:t>
+      </w:r>
+    </w:p>
+    <w:p>
+      <w:r>
+        <w:rPr>
+          <w:b/>
+        </w:rPr>
+        <w:t>Net:</w:t>
+      </w:r>
+      <w:r>
+        <w:t xml:space="preserve"> mirroring's CI/CD moves *which tables to replicate*, but per environment you still create a</w:t>
+      </w:r>
+    </w:p>
+    <w:p>
+      <w:r>
+        <w:t xml:space="preserve">connection, add a deployment rule, get the DBA to enable CDC on that Oracle, </w:t>
+      </w:r>
+      <w:r>
+        <w:rPr>
+          <w:b/>
+        </w:rPr>
+        <w:t>start</w:t>
+      </w:r>
+      <w:r>
+        <w:t xml:space="preserve"> the mirror,</w:t>
+      </w:r>
+    </w:p>
+    <w:p>
+      <w:r>
+        <w:t xml:space="preserve">and wait out a </w:t>
+      </w:r>
+      <w:r>
+        <w:rPr>
+          <w:b/>
+        </w:rPr>
+        <w:t>re-seed</w:t>
+      </w:r>
+      <w:r>
+        <w:t xml:space="preserve"> — then promote your silver/gold/security </w:t>
+      </w:r>
+      <w:r>
+        <w:rPr>
+          <w:b/>
+        </w:rPr>
+        <w:t>separately</w:t>
+      </w:r>
+      <w:r>
+        <w:t>. The framework</w:t>
+      </w:r>
+    </w:p>
+    <w:p>
+      <w:r>
+        <w:t xml:space="preserve">promotes the whole pipeline, raw acquisition through governed gold, as a </w:t>
+      </w:r>
+      <w:r>
+        <w:rPr>
+          <w:b/>
+        </w:rPr>
+        <w:t>single</w:t>
+      </w:r>
+      <w:r>
+        <w:t xml:space="preserve"> config-as-code</w:t>
+      </w:r>
+    </w:p>
+    <w:p>
+      <w:r>
+        <w:t>artifact. For a three-environment pension estate, that difference is the gap between one repeatable</w:t>
+      </w:r>
+    </w:p>
+    <w:p>
+      <w:r>
+        <w:rPr>
+          <w:rFonts w:ascii="Consolas" w:hAnsi="Consolas"/>
+          <w:color w:val="A31F34"/>
+        </w:rPr>
+        <w:t>cp_config</w:t>
+      </w:r>
+      <w:r>
+        <w:t xml:space="preserve"> run and a portal-plus-DBA checklist repeated in each workspace.</w:t>
       </w:r>
     </w:p>
     <w:p>
@@ -3593,17 +3994,7 @@
       </w:pPr>
       <w:r/>
       <w:r>
-        <w:t>5. Promotion across environments (DEV → UAT → PROD)</w:t>
-      </w:r>
-    </w:p>
-    <w:p>
-      <w:r>
-        <w:t>This is where the two diverge most for a governed shop — the user explicitly asked, so it's worth</w:t>
-      </w:r>
-    </w:p>
-    <w:p>
-      <w:r>
-        <w:t>its own section.</w:t>
+        <w:t>6. When to choose which</w:t>
       </w:r>
     </w:p>
     <w:p>
@@ -3611,390 +4002,111 @@
         <w:rPr>
           <w:b/>
         </w:rPr>
-        <w:t>Our framework — one config-as-code unit.</w:t>
-      </w:r>
-      <w:r>
-        <w:t xml:space="preserve"> The *entire* medallion — sources, subset/</w:t>
-      </w:r>
-      <w:r>
-        <w:rPr>
-          <w:rFonts w:ascii="Consolas" w:hAnsi="Consolas"/>
-          <w:color w:val="A31F34"/>
-        </w:rPr>
-        <w:t>select</w:t>
-      </w:r>
-    </w:p>
-    <w:p>
-      <w:r>
-        <w:t xml:space="preserve">rules, </w:t>
-      </w:r>
-      <w:r>
-        <w:rPr>
-          <w:rFonts w:ascii="Consolas" w:hAnsi="Consolas"/>
-          <w:color w:val="A31F34"/>
-        </w:rPr>
-        <w:t>cleanse_rule</w:t>
-      </w:r>
-      <w:r>
-        <w:t xml:space="preserve">, </w:t>
-      </w:r>
-      <w:r>
-        <w:rPr>
-          <w:rFonts w:ascii="Consolas" w:hAnsi="Consolas"/>
-          <w:color w:val="A31F34"/>
-        </w:rPr>
-        <w:t>dq_rule</w:t>
-      </w:r>
-      <w:r>
-        <w:t xml:space="preserve">, the gold </w:t>
-      </w:r>
-      <w:r>
-        <w:rPr>
-          <w:rFonts w:ascii="Consolas" w:hAnsi="Consolas"/>
-          <w:color w:val="A31F34"/>
-        </w:rPr>
-        <w:t>model</w:t>
-      </w:r>
-      <w:r>
-        <w:t>/</w:t>
-      </w:r>
-      <w:r>
-        <w:rPr>
-          <w:rFonts w:ascii="Consolas" w:hAnsi="Consolas"/>
-          <w:color w:val="A31F34"/>
-        </w:rPr>
-        <w:t>gold_object</w:t>
-      </w:r>
-      <w:r>
-        <w:t xml:space="preserve">, and </w:t>
-      </w:r>
-      <w:r>
-        <w:rPr>
-          <w:rFonts w:ascii="Consolas" w:hAnsi="Consolas"/>
-          <w:color w:val="A31F34"/>
-        </w:rPr>
-        <w:t>security_policy</w:t>
-      </w:r>
-      <w:r>
-        <w:t xml:space="preserve"> — lives in</w:t>
-      </w:r>
-    </w:p>
-    <w:p>
-      <w:r>
-        <w:rPr>
-          <w:rFonts w:ascii="Consolas" w:hAnsi="Consolas"/>
-          <w:color w:val="A31F34"/>
-        </w:rPr>
-        <w:t>config_db</w:t>
-      </w:r>
-      <w:r>
-        <w:t xml:space="preserve"> and promotes as YAML (</w:t>
-      </w:r>
-      <w:r>
-        <w:rPr>
-          <w:rFonts w:ascii="Consolas" w:hAnsi="Consolas"/>
-          <w:color w:val="A31F34"/>
-        </w:rPr>
-        <w:t>cp_config</w:t>
-      </w:r>
-      <w:r>
-        <w:t>) alongside the bundled engine, which deploys</w:t>
-      </w:r>
-    </w:p>
-    <w:p>
+        <w:t>Lean Mirroring when</w:t>
+      </w:r>
+      <w:r>
+        <w:t xml:space="preserve"> *all* hold: the table needs </w:t>
+      </w:r>
       <w:r>
         <w:rPr>
           <w:b/>
         </w:rPr>
-        <w:t>identically</w:t>
-      </w:r>
-      <w:r>
-        <w:t xml:space="preserve"> to every environment. Connections resolve from a Key Vault </w:t>
-      </w:r>
-      <w:r>
-        <w:rPr>
-          <w:rFonts w:ascii="Consolas" w:hAnsi="Consolas"/>
-          <w:color w:val="A31F34"/>
-        </w:rPr>
-        <w:t>secret_name</w:t>
-      </w:r>
-      <w:r>
-        <w:t xml:space="preserve"> (one secret</w:t>
+        <w:t>near-real-time</w:t>
+      </w:r>
+      <w:r>
+        <w:t xml:space="preserve"> freshness; it's **cleanly</w:t>
       </w:r>
     </w:p>
     <w:p>
       <w:r>
-        <w:t>per env), so pointing DEV / UAT / PROD at their own Oracle is a per-env *secret*, not a code change.</w:t>
-      </w:r>
-    </w:p>
-    <w:p>
-      <w:r>
-        <w:t xml:space="preserve">Promotion is </w:t>
-      </w:r>
-      <w:r>
-        <w:rPr>
-          <w:rFonts w:ascii="Consolas" w:hAnsi="Consolas"/>
-          <w:color w:val="A31F34"/>
-        </w:rPr>
-        <w:t>git → cp_bootstrap/cp_config</w:t>
-      </w:r>
-      <w:r>
-        <w:t xml:space="preserve"> per environment: **ingestion, transformation, DQ, gold,</w:t>
-      </w:r>
-    </w:p>
-    <w:p>
-      <w:r>
-        <w:t>and security move together**, versioned and diffable, with no portal clicks.</w:t>
-      </w:r>
-    </w:p>
-    <w:p>
+        <w:t>relational</w:t>
+      </w:r>
       <w:r>
         <w:rPr>
           <w:b/>
         </w:rPr>
-        <w:t>Mirroring — the replica config promotes; the rest is per-env manual.</w:t>
-      </w:r>
-      <w:r>
-        <w:t xml:space="preserve"> Mirrored databases *do*</w:t>
+        <w:t xml:space="preserve"> (PK/unique index, supported types, no LOBs); the DBA </w:t>
+      </w:r>
+      <w:r>
+        <w:t>can and will enable CDC**; and</w:t>
       </w:r>
     </w:p>
     <w:p>
-      <w:r>
-        <w:t>support Git integration and deployment pipelines now — but with real seams that add up per stage:</w:t>
-      </w:r>
-    </w:p>
-    <w:p>
-      <w:pPr>
-        <w:pStyle w:val="ListBullet"/>
-        <w:ind w:left="360"/>
-      </w:pPr>
       <w:r>
         <w:rPr>
           <w:b/>
         </w:rPr>
-        <w:t>Only the mirror item is tracked in Git</w:t>
-      </w:r>
-      <w:r>
-        <w:t xml:space="preserve"> (</w:t>
-      </w:r>
-      <w:r>
-        <w:rPr>
-          <w:rFonts w:ascii="Consolas" w:hAnsi="Consolas"/>
-          <w:color w:val="A31F34"/>
-        </w:rPr>
-        <w:t>mirroring.json</w:t>
-      </w:r>
-      <w:r>
-        <w:t xml:space="preserve"> = the table selection). The</w:t>
+        <w:t>little/no transformation or masking is required at bronze</w:t>
+      </w:r>
+      <w:r>
+        <w:t>. Typical fit: a handful of</w:t>
       </w:r>
     </w:p>
     <w:p>
       <w:r>
-        <w:t xml:space="preserve">  </w:t>
-      </w:r>
+        <w:t>high-value operational tables for live dashboards.</w:t>
+      </w:r>
+    </w:p>
+    <w:p>
       <w:r>
         <w:rPr>
           <w:b/>
         </w:rPr>
-        <w:t>connection, credentials, gateway, SQL analytics endpoint, and any views are *not* tracked</w:t>
-      </w:r>
-      <w:r>
-        <w:t>.</w:t>
-      </w:r>
-    </w:p>
-    <w:p>
-      <w:pPr>
-        <w:pStyle w:val="ListBullet"/>
-        <w:ind w:left="360"/>
-      </w:pPr>
-      <w:r>
-        <w:t xml:space="preserve">Deploying to a stage needs a </w:t>
+        <w:t>Lean our framework when</w:t>
+      </w:r>
+      <w:r>
+        <w:t xml:space="preserve"> any hold: you must </w:t>
       </w:r>
       <w:r>
         <w:rPr>
           <w:b/>
         </w:rPr>
-        <w:t>deployment rule</w:t>
-      </w:r>
-      <w:r>
-        <w:t xml:space="preserve"> to rebind the mirror to *that* environment's</w:t>
+        <w:t>subset, type, mask, or DQ-gate at ingest</w:t>
       </w:r>
     </w:p>
     <w:p>
       <w:r>
-        <w:t xml:space="preserve">  </w:t>
+        <w:t xml:space="preserve">(sensitive data); the source </w:t>
       </w:r>
       <w:r>
         <w:rPr>
           <w:b/>
         </w:rPr>
-        <w:t>source connection ID</w:t>
-      </w:r>
-      <w:r>
-        <w:t xml:space="preserve"> — so you first create the env's gateway connection, then wire the rule.</w:t>
+        <w:t>can't take CDC changes</w:t>
+      </w:r>
+      <w:r>
+        <w:t xml:space="preserve"> or is a non-mirrorable type/shape; you need</w:t>
       </w:r>
     </w:p>
     <w:p>
-      <w:pPr>
-        <w:pStyle w:val="ListBullet"/>
-        <w:ind w:left="360"/>
-      </w:pPr>
-      <w:r>
-        <w:t xml:space="preserve">The mirror </w:t>
-      </w:r>
       <w:r>
         <w:rPr>
           <w:b/>
         </w:rPr>
-        <w:t>isn't started after deployment</w:t>
-      </w:r>
-      <w:r>
-        <w:t xml:space="preserve"> — you start it manually (or via API) in each env,</w:t>
-      </w:r>
-    </w:p>
-    <w:p>
-      <w:r>
-        <w:t xml:space="preserve">  which triggers a </w:t>
+        <w:t>one pattern across heterogeneous sources</w:t>
+      </w:r>
+      <w:r>
+        <w:t xml:space="preserve"> (Oracle + APIs + files); </w:t>
       </w:r>
       <w:r>
         <w:rPr>
           <w:b/>
         </w:rPr>
-        <w:t>full re-seed</w:t>
-      </w:r>
-      <w:r>
-        <w:t xml:space="preserve"> (fresh initial copy) from that environment's source.</w:t>
+        <w:t>batch latency is acceptable</w:t>
       </w:r>
     </w:p>
     <w:p>
-      <w:pPr>
-        <w:pStyle w:val="ListBullet"/>
-        <w:ind w:left="360"/>
-      </w:pPr>
-      <w:r>
-        <w:t xml:space="preserve">The </w:t>
+      <w:r>
+        <w:t xml:space="preserve">(most pension analytics); or you want </w:t>
       </w:r>
       <w:r>
         <w:rPr>
           <w:b/>
         </w:rPr>
-        <w:t>source-side CDC prerequisites</w:t>
-      </w:r>
-      <w:r>
-        <w:t xml:space="preserve"> (ARCHIVELOG, LogMiner, supplemental logging, grants) must be</w:t>
-      </w:r>
-    </w:p>
-    <w:p>
-      <w:r>
-        <w:t xml:space="preserve">  enabled by the DBA on </w:t>
-      </w:r>
-      <w:r>
-        <w:rPr>
-          <w:b/>
-        </w:rPr>
-        <w:t>each</w:t>
-      </w:r>
-      <w:r>
-        <w:t xml:space="preserve"> environment's Oracle — that isn't deployable at all.</w:t>
-      </w:r>
-    </w:p>
-    <w:p>
-      <w:pPr>
-        <w:pStyle w:val="ListBullet"/>
-        <w:ind w:left="360"/>
-      </w:pPr>
-      <w:r>
-        <w:rPr>
-          <w:b/>
-        </w:rPr>
-        <w:t>Downstream objects aren't promoted with the mirror</w:t>
-      </w:r>
-      <w:r>
-        <w:t xml:space="preserve"> — SQL-endpoint views (and of course your</w:t>
-      </w:r>
-    </w:p>
-    <w:p>
-      <w:r>
-        <w:t xml:space="preserve">  silver/gold and security) are a separate ALM track.</w:t>
-      </w:r>
-    </w:p>
-    <w:p>
-      <w:r>
-        <w:rPr>
-          <w:b/>
-        </w:rPr>
-        <w:t>Net:</w:t>
-      </w:r>
-      <w:r>
-        <w:t xml:space="preserve"> mirroring's CI/CD moves *which tables to replicate*, but per environment you still create a</w:t>
-      </w:r>
-    </w:p>
-    <w:p>
-      <w:r>
-        <w:t xml:space="preserve">connection, add a deployment rule, get the DBA to enable CDC on that Oracle, </w:t>
-      </w:r>
-      <w:r>
-        <w:rPr>
-          <w:b/>
-        </w:rPr>
-        <w:t>start</w:t>
-      </w:r>
-      <w:r>
-        <w:t xml:space="preserve"> the mirror,</w:t>
-      </w:r>
-    </w:p>
-    <w:p>
-      <w:r>
-        <w:t xml:space="preserve">and wait out a </w:t>
-      </w:r>
-      <w:r>
-        <w:rPr>
-          <w:b/>
-        </w:rPr>
-        <w:t>re-seed</w:t>
-      </w:r>
-      <w:r>
-        <w:t xml:space="preserve"> — then promote your silver/gold/security </w:t>
-      </w:r>
-      <w:r>
-        <w:rPr>
-          <w:b/>
-        </w:rPr>
-        <w:t>separately</w:t>
-      </w:r>
-      <w:r>
-        <w:t>. The framework</w:t>
-      </w:r>
-    </w:p>
-    <w:p>
-      <w:r>
-        <w:t xml:space="preserve">promotes the whole pipeline, raw acquisition through governed gold, as a </w:t>
-      </w:r>
-      <w:r>
-        <w:rPr>
-          <w:b/>
-        </w:rPr>
-        <w:t>single</w:t>
-      </w:r>
-      <w:r>
-        <w:t xml:space="preserve"> config-as-code</w:t>
-      </w:r>
-    </w:p>
-    <w:p>
-      <w:r>
-        <w:t>artifact. For a three-environment pension estate, that difference is the gap between one repeatable</w:t>
-      </w:r>
-    </w:p>
-    <w:p>
-      <w:r>
-        <w:rPr>
-          <w:rFonts w:ascii="Consolas" w:hAnsi="Consolas"/>
-          <w:color w:val="A31F34"/>
-        </w:rPr>
-        <w:t>cp_config</w:t>
-      </w:r>
-      <w:r>
-        <w:t xml:space="preserve"> run and a portal-plus-DBA checklist repeated in each workspace.</w:t>
+        <w:t>config-as-code promotion and lineage</w:t>
+      </w:r>
+      <w:r>
+        <w:t>.</w:t>
       </w:r>
     </w:p>
     <w:p>
@@ -4003,127 +4115,6 @@
       </w:pPr>
       <w:r/>
       <w:r>
-        <w:t>6. When to choose which</w:t>
-      </w:r>
-    </w:p>
-    <w:p>
-      <w:r>
-        <w:rPr>
-          <w:b/>
-        </w:rPr>
-        <w:t>Lean Mirroring when</w:t>
-      </w:r>
-      <w:r>
-        <w:t xml:space="preserve"> *all* hold: the table needs </w:t>
-      </w:r>
-      <w:r>
-        <w:rPr>
-          <w:b/>
-        </w:rPr>
-        <w:t>near-real-time</w:t>
-      </w:r>
-      <w:r>
-        <w:t xml:space="preserve"> freshness; it's **cleanly</w:t>
-      </w:r>
-    </w:p>
-    <w:p>
-      <w:r>
-        <w:t>relational</w:t>
-      </w:r>
-      <w:r>
-        <w:rPr>
-          <w:b/>
-        </w:rPr>
-        <w:t xml:space="preserve"> (PK/unique index, supported types, no LOBs); the DBA </w:t>
-      </w:r>
-      <w:r>
-        <w:t>can and will enable CDC**; and</w:t>
-      </w:r>
-    </w:p>
-    <w:p>
-      <w:r>
-        <w:rPr>
-          <w:b/>
-        </w:rPr>
-        <w:t>little/no transformation or masking is required at bronze</w:t>
-      </w:r>
-      <w:r>
-        <w:t>. Typical fit: a handful of</w:t>
-      </w:r>
-    </w:p>
-    <w:p>
-      <w:r>
-        <w:t>high-value operational tables for live dashboards.</w:t>
-      </w:r>
-    </w:p>
-    <w:p>
-      <w:r>
-        <w:rPr>
-          <w:b/>
-        </w:rPr>
-        <w:t>Lean our framework when</w:t>
-      </w:r>
-      <w:r>
-        <w:t xml:space="preserve"> any hold: you must </w:t>
-      </w:r>
-      <w:r>
-        <w:rPr>
-          <w:b/>
-        </w:rPr>
-        <w:t>subset, type, mask, or DQ-gate at ingest</w:t>
-      </w:r>
-    </w:p>
-    <w:p>
-      <w:r>
-        <w:t xml:space="preserve">(sensitive data); the source </w:t>
-      </w:r>
-      <w:r>
-        <w:rPr>
-          <w:b/>
-        </w:rPr>
-        <w:t>can't take CDC changes</w:t>
-      </w:r>
-      <w:r>
-        <w:t xml:space="preserve"> or is a non-mirrorable type/shape; you need</w:t>
-      </w:r>
-    </w:p>
-    <w:p>
-      <w:r>
-        <w:rPr>
-          <w:b/>
-        </w:rPr>
-        <w:t>one pattern across heterogeneous sources</w:t>
-      </w:r>
-      <w:r>
-        <w:t xml:space="preserve"> (Oracle + APIs + files); </w:t>
-      </w:r>
-      <w:r>
-        <w:rPr>
-          <w:b/>
-        </w:rPr>
-        <w:t>batch latency is acceptable</w:t>
-      </w:r>
-    </w:p>
-    <w:p>
-      <w:r>
-        <w:t xml:space="preserve">(most pension analytics); or you want </w:t>
-      </w:r>
-      <w:r>
-        <w:rPr>
-          <w:b/>
-        </w:rPr>
-        <w:t>config-as-code promotion and lineage</w:t>
-      </w:r>
-      <w:r>
-        <w:t>.</w:t>
-      </w:r>
-    </w:p>
-    <w:p>
-      <w:pPr>
-        <w:pStyle w:val="Heading2"/>
-      </w:pPr>
-      <w:r/>
-      <w:r>
         <w:t>7. Recommendation for BCPC</w:t>
       </w:r>
     </w:p>
@@ -4227,19 +4218,29 @@
         <w:rPr>
           <w:b/>
         </w:rPr>
-        <w:t>Maturity.</w:t>
-      </w:r>
-      <w:r>
-        <w:t xml:space="preserve"> Oracle mirroring is </w:t>
+        <w:t>Maturity is no longer the differentiator.</w:t>
+      </w:r>
+      <w:r>
+        <w:t xml:space="preserve"> Oracle mirroring is now </w:t>
       </w:r>
       <w:r>
         <w:rPr>
           <w:b/>
         </w:rPr>
-        <w:t>Preview</w:t>
-      </w:r>
-      <w:r>
-        <w:t>; the framework is in production here now.</w:t>
+        <w:t>GA</w:t>
+      </w:r>
+      <w:r>
+        <w:t xml:space="preserve"> (2026), so</w:t>
+      </w:r>
+    </w:p>
+    <w:p>
+      <w:r>
+        <w:t xml:space="preserve">   readiness isn't the reason to prefer one path — the decision rests on the factors above</w:t>
+      </w:r>
+    </w:p>
+    <w:p>
+      <w:r>
+        <w:t xml:space="preserve">   (governance/PII, no source changes, one pattern, gateway reuse), not on Preview status.</w:t>
       </w:r>
     </w:p>
     <w:p>
@@ -4335,7 +4336,7 @@
         <w:t>But adopt Mirroring selectively, as a hybrid</w:t>
       </w:r>
       <w:r>
-        <w:t>, once it's GA and where it clearly wins: for a</w:t>
+        <w:t xml:space="preserve"> (it's GA now), where it clearly wins: for a</w:t>
       </w:r>
     </w:p>
     <w:p>
@@ -4451,7 +4452,7 @@
           <w:color w:val="1A5FB4"/>
           <w:u w:val="single"/>
         </w:rPr>
-        <w:t>Mirroring for Oracle (Preview) announcement</w:t>
+        <w:t>Mirroring for Oracle launch announcement</w:t>
       </w:r>
       <w:r>
         <w:t xml:space="preserve"> ·</w:t>
@@ -4471,7 +4472,21 @@
     </w:p>
     <w:p>
       <w:r>
-        <w:t>Oracle mirroring is Preview as of this writing; verify limits before committing.</w:t>
+        <w:t xml:space="preserve">Oracle mirroring is </w:t>
+      </w:r>
+      <w:r>
+        <w:rPr>
+          <w:b/>
+        </w:rPr>
+        <w:t>GA</w:t>
+      </w:r>
+      <w:r>
+        <w:t xml:space="preserve"> as of 2026 (the Microsoft Learn docs no longer carry a Preview label);</w:t>
+      </w:r>
+    </w:p>
+    <w:p>
+      <w:r>
+        <w:t>verify current limits and supported Oracle environments before committing.</w:t>
       </w:r>
     </w:p>
     <w:sectPr>

</xml_diff>

<commit_message>
BRONZE_VS_MIRRORING: verify claims vs current MS Learn; add broad-grants + read-write-only
Cross-checked every mirroring claim against the current Microsoft Learn pages (oracle,
oracle-limitations, oracle-tutorial, mirrored-database-cicd; all refreshed 2026). All existing
points confirmed. Added two verified facts the doc had understated: the sync user needs
instance-wide SELECT ANY TABLE + SELECT ANY DICTIONARY (not per-table), and the source must be in
read-write mode (LogMiner can't mirror a read-only standby/DR). Updated the mirroring diagram
prerequisites callout to match.
</commit_message>
<xml_diff>
--- a/control_plane/docs/BRONZE_VS_MIRRORING.docx
+++ b/control_plane/docs/BRONZE_VS_MIRRORING.docx
@@ -882,7 +882,20 @@
               <w:rPr>
                 <w:sz w:val="18"/>
               </w:rPr>
-              <w:t>: ARCHIVELOG, LogMiner, supplemental logging (DB + per-table), CDC grants (</w:t>
+              <w:t xml:space="preserve">: ARCHIVELOG, LogMiner, supplemental logging (DB + per-table), and </w:t>
+            </w:r>
+            <w:r>
+              <w:rPr>
+                <w:b/>
+                <w:sz w:val="18"/>
+              </w:rPr>
+              <w:t>broad grants</w:t>
+            </w:r>
+            <w:r>
+              <w:rPr>
+                <w:sz w:val="18"/>
+              </w:rPr>
+              <w:t xml:space="preserve"> — </w:t>
             </w:r>
             <w:r>
               <w:rPr>
@@ -910,7 +923,47 @@
               <w:rPr>
                 <w:sz w:val="18"/>
               </w:rPr>
-              <w:t>, …)</w:t>
+              <w:t xml:space="preserve">, </w:t>
+            </w:r>
+            <w:r>
+              <w:rPr>
+                <w:b/>
+                <w:sz w:val="18"/>
+              </w:rPr>
+              <w:t>`SELECT ANY TABLE`</w:t>
+            </w:r>
+            <w:r>
+              <w:rPr>
+                <w:sz w:val="18"/>
+              </w:rPr>
+              <w:t xml:space="preserve">, </w:t>
+            </w:r>
+            <w:r>
+              <w:rPr>
+                <w:rFonts w:ascii="Consolas" w:hAnsi="Consolas"/>
+                <w:color w:val="A31F34"/>
+                <w:sz w:val="18"/>
+              </w:rPr>
+              <w:t>SELECT ANY DICTIONARY</w:t>
+            </w:r>
+            <w:r>
+              <w:rPr>
+                <w:sz w:val="18"/>
+              </w:rPr>
+              <w:t xml:space="preserve"> (instance-wide read); source must be in </w:t>
+            </w:r>
+            <w:r>
+              <w:rPr>
+                <w:b/>
+                <w:sz w:val="18"/>
+              </w:rPr>
+              <w:t>read-write mode</w:t>
+            </w:r>
+            <w:r>
+              <w:rPr>
+                <w:sz w:val="18"/>
+              </w:rPr>
+              <w:t xml:space="preserve"> (LogMiner can't mirror a read-only standby)</w:t>
             </w:r>
           </w:p>
         </w:tc>
@@ -935,7 +988,7 @@
               <w:rPr>
                 <w:sz w:val="18"/>
               </w:rPr>
-              <w:t xml:space="preserve">: a read account with </w:t>
+              <w:t xml:space="preserve">: </w:t>
             </w:r>
             <w:r>
               <w:rPr>
@@ -944,6 +997,19 @@
                 <w:sz w:val="18"/>
               </w:rPr>
               <w:t>SELECT</w:t>
+            </w:r>
+            <w:r>
+              <w:rPr>
+                <w:sz w:val="18"/>
+              </w:rPr>
+              <w:t xml:space="preserve"> on just the target tables — and it can read a </w:t>
+            </w:r>
+            <w:r>
+              <w:rPr>
+                <w:b/>
+                <w:sz w:val="18"/>
+              </w:rPr>
+              <w:t>read-only standby / DR replica</w:t>
             </w:r>
           </w:p>
         </w:tc>
@@ -3308,12 +3374,27 @@
         <w:t>Coverage gaps</w:t>
       </w:r>
       <w:r>
-        <w:t xml:space="preserve"> — no LOB/XML/complex types, no type-change DDL, tables must have a PK/unique</w:t>
+        <w:t xml:space="preserve"> — supported types are a fixed allow-list (no LOB/XML/complex types; even plain</w:t>
       </w:r>
     </w:p>
     <w:p>
       <w:r>
-        <w:t xml:space="preserve">  index, ≤ 1000 tables, name-length limits. Any table that misses these simply won't mirror.</w:t>
+        <w:t xml:space="preserve">  </w:t>
+      </w:r>
+      <w:r>
+        <w:rPr>
+          <w:rFonts w:ascii="Consolas" w:hAnsi="Consolas"/>
+          <w:color w:val="A31F34"/>
+        </w:rPr>
+        <w:t>TIMESTAMP</w:t>
+      </w:r>
+      <w:r>
+        <w:t xml:space="preserve"> variants are restricted), no type-change DDL, tables must have a PK/unique index,</w:t>
+      </w:r>
+    </w:p>
+    <w:p>
+      <w:r>
+        <w:t xml:space="preserve">  ≤ 1000 tables, table names &lt; 30 chars. Any table that misses these simply won't mirror.</w:t>
       </w:r>
     </w:p>
     <w:p>
@@ -3322,16 +3403,49 @@
         <w:ind w:left="360"/>
       </w:pPr>
       <w:r>
-        <w:t xml:space="preserve">You still build </w:t>
-      </w:r>
-      <w:r>
         <w:rPr>
           <w:b/>
         </w:rPr>
-        <w:t>silver/gold</w:t>
-      </w:r>
-      <w:r>
-        <w:t xml:space="preserve"> — mirroring is not a substitute for the modelling layer.</w:t>
+        <w:t>Broad, instance-wide grants</w:t>
+      </w:r>
+      <w:r>
+        <w:t xml:space="preserve"> — the sync user needs </w:t>
+      </w:r>
+      <w:r>
+        <w:rPr>
+          <w:rFonts w:ascii="Consolas" w:hAnsi="Consolas"/>
+          <w:color w:val="A31F34"/>
+        </w:rPr>
+        <w:t>SELECT ANY TABLE</w:t>
+      </w:r>
+      <w:r>
+        <w:t xml:space="preserve"> </w:t>
+      </w:r>
+      <w:r>
+        <w:rPr>
+          <w:b/>
+        </w:rPr>
+        <w:t>and</w:t>
+      </w:r>
+    </w:p>
+    <w:p>
+      <w:r>
+        <w:t xml:space="preserve">  </w:t>
+      </w:r>
+      <w:r>
+        <w:rPr>
+          <w:rFonts w:ascii="Consolas" w:hAnsi="Consolas"/>
+          <w:color w:val="A31F34"/>
+        </w:rPr>
+        <w:t>SELECT ANY DICTIONARY</w:t>
+      </w:r>
+      <w:r>
+        <w:t xml:space="preserve"> (read *everything* in the instance), not just the tables you mirror — a</w:t>
+      </w:r>
+    </w:p>
+    <w:p>
+      <w:r>
+        <w:t xml:space="preserve">  real least-privilege concern in a pension estate.</w:t>
       </w:r>
     </w:p>
     <w:p>
@@ -3343,15 +3457,15 @@
         <w:rPr>
           <w:b/>
         </w:rPr>
-        <w:t>New dedicated gateway</w:t>
-      </w:r>
-      <w:r>
-        <w:t xml:space="preserve"> — mirroring uses the on-premises data gateway only; our existing **VNet</w:t>
+        <w:t>Read-write source only</w:t>
+      </w:r>
+      <w:r>
+        <w:t xml:space="preserve"> — LogMiner can't run against a read-only **physical standby / DR</w:t>
       </w:r>
     </w:p>
     <w:p>
       <w:r>
-        <w:t xml:space="preserve">  gateway can't be reused**, so it's fresh infra to stand up, patch, and HA-cluster for 24/7 CDC.</w:t>
+        <w:t xml:space="preserve">  replica**, so capture can't be offloaded off the primary.</w:t>
       </w:r>
     </w:p>
     <w:p>
@@ -3360,6 +3474,44 @@
         <w:ind w:left="360"/>
       </w:pPr>
       <w:r>
+        <w:t xml:space="preserve">You still build </w:t>
+      </w:r>
+      <w:r>
+        <w:rPr>
+          <w:b/>
+        </w:rPr>
+        <w:t>silver/gold</w:t>
+      </w:r>
+      <w:r>
+        <w:t xml:space="preserve"> — mirroring is not a substitute for the modelling layer.</w:t>
+      </w:r>
+    </w:p>
+    <w:p>
+      <w:pPr>
+        <w:pStyle w:val="ListBullet"/>
+        <w:ind w:left="360"/>
+      </w:pPr>
+      <w:r>
+        <w:rPr>
+          <w:b/>
+        </w:rPr>
+        <w:t>New dedicated gateway</w:t>
+      </w:r>
+      <w:r>
+        <w:t xml:space="preserve"> — mirroring uses the on-premises data gateway only; our existing **VNet</w:t>
+      </w:r>
+    </w:p>
+    <w:p>
+      <w:r>
+        <w:t xml:space="preserve">  gateway can't be reused**, so it's fresh infra to stand up, patch, and HA-cluster for 24/7 CDC.</w:t>
+      </w:r>
+    </w:p>
+    <w:p>
+      <w:pPr>
+        <w:pStyle w:val="ListBullet"/>
+        <w:ind w:left="360"/>
+      </w:pPr>
+      <w:r>
         <w:t>Ops caveats: dedicated gateway VM, archive-log retention (~24h), memory spikes on large reseeds.</w:t>
       </w:r>
     </w:p>
@@ -3434,10 +3586,10 @@
         <w:rPr>
           <w:b/>
         </w:rPr>
-        <w:t>No source changes</w:t>
-      </w:r>
-      <w:r>
-        <w:t xml:space="preserve"> — only a </w:t>
+        <w:t>No source changes, least privilege</w:t>
+      </w:r>
+      <w:r>
+        <w:t xml:space="preserve"> — only </w:t>
       </w:r>
       <w:r>
         <w:rPr>
@@ -3447,7 +3599,51 @@
         <w:t>SELECT</w:t>
       </w:r>
       <w:r>
-        <w:t xml:space="preserve"> account; nothing to enable on the Oracle side.</w:t>
+        <w:t xml:space="preserve"> on the specific tables (not the</w:t>
+      </w:r>
+    </w:p>
+    <w:p>
+      <w:r>
+        <w:t xml:space="preserve">  instance-wide </w:t>
+      </w:r>
+      <w:r>
+        <w:rPr>
+          <w:rFonts w:ascii="Consolas" w:hAnsi="Consolas"/>
+          <w:color w:val="A31F34"/>
+        </w:rPr>
+        <w:t>SELECT ANY TABLE</w:t>
+      </w:r>
+      <w:r>
+        <w:t xml:space="preserve"> / </w:t>
+      </w:r>
+      <w:r>
+        <w:rPr>
+          <w:rFonts w:ascii="Consolas" w:hAnsi="Consolas"/>
+          <w:color w:val="A31F34"/>
+        </w:rPr>
+        <w:t>SELECT ANY DICTIONARY</w:t>
+      </w:r>
+      <w:r>
+        <w:t xml:space="preserve"> mirroring requires), and nothing to</w:t>
+      </w:r>
+    </w:p>
+    <w:p>
+      <w:r>
+        <w:t xml:space="preserve">  enable on the Oracle side. It can even read a </w:t>
+      </w:r>
+      <w:r>
+        <w:rPr>
+          <w:b/>
+        </w:rPr>
+        <w:t>read-only standby / DR replica</w:t>
+      </w:r>
+      <w:r>
+        <w:t>, keeping load off</w:t>
+      </w:r>
+    </w:p>
+    <w:p>
+      <w:r>
+        <w:t xml:space="preserve">  the primary — mirroring can't (LogMiner needs a read-write source).</w:t>
       </w:r>
     </w:p>
     <w:p>

</xml_diff>